<commit_message>
feat: enhance designs by adding svg and dark mode toggle
</commit_message>
<xml_diff>
--- a/Dava_Hannas_Putra_ATS_CV.docx
+++ b/Dava_Hannas_Putra_ATS_CV.docx
@@ -40,39 +40,7 @@
           <w:sz w:val="20"/>
           <w:szCs w:val="20"/>
         </w:rPr>
-        <w:t xml:space="preserve">Bogor, West Java </w:t>
-      </w:r>
-      <w:proofErr w:type="gramStart"/>
-      <w:r>
-        <w:rPr>
-          <w:sz w:val="20"/>
-          <w:szCs w:val="20"/>
-        </w:rPr>
-        <w:t>16118  |</w:t>
-      </w:r>
-      <w:proofErr w:type="gramEnd"/>
-      <w:r>
-        <w:rPr>
-          <w:sz w:val="20"/>
-          <w:szCs w:val="20"/>
-        </w:rPr>
-        <w:t xml:space="preserve">  +62 821 2402 </w:t>
-      </w:r>
-      <w:proofErr w:type="gramStart"/>
-      <w:r>
-        <w:rPr>
-          <w:sz w:val="20"/>
-          <w:szCs w:val="20"/>
-        </w:rPr>
-        <w:t>4280  |</w:t>
-      </w:r>
-      <w:proofErr w:type="gramEnd"/>
-      <w:r>
-        <w:rPr>
-          <w:sz w:val="20"/>
-          <w:szCs w:val="20"/>
-        </w:rPr>
-        <w:t xml:space="preserve">  davahsp@gmail.com</w:t>
+        <w:t>Bogor, West Java 16118  |  +62 821 2402 4280  |  davahsp@gmail.com</w:t>
       </w:r>
     </w:p>
     <w:p>
@@ -191,6 +159,66 @@
         <w:t>DigitalOcean</w:t>
       </w:r>
       <w:proofErr w:type="spellEnd"/>
+      <w:r>
+        <w:t>,</w:t>
+      </w:r>
+      <w:r>
+        <w:t xml:space="preserve"> AWS EC2, Docker, Kubernetes</w:t>
+      </w:r>
+      <w:r>
+        <w:t xml:space="preserve"> </w:t>
+      </w:r>
+    </w:p>
+    <w:p>
+      <w:pPr>
+        <w:spacing w:before="60" w:after="60"/>
+      </w:pPr>
+      <w:r>
+        <w:rPr>
+          <w:b/>
+          <w:bCs/>
+        </w:rPr>
+        <w:t xml:space="preserve">API &amp; </w:t>
+      </w:r>
+      <w:r>
+        <w:rPr>
+          <w:b/>
+          <w:bCs/>
+        </w:rPr>
+        <w:t>Integration</w:t>
+      </w:r>
+      <w:r>
+        <w:rPr>
+          <w:b/>
+          <w:bCs/>
+        </w:rPr>
+        <w:t>s</w:t>
+      </w:r>
+      <w:r>
+        <w:rPr>
+          <w:b/>
+          <w:bCs/>
+        </w:rPr>
+        <w:t xml:space="preserve">: </w:t>
+      </w:r>
+      <w:r>
+        <w:t>Twilio</w:t>
+      </w:r>
+      <w:r>
+        <w:t xml:space="preserve"> API</w:t>
+      </w:r>
+      <w:r>
+        <w:t>, Gemini API</w:t>
+      </w:r>
+      <w:r>
+        <w:t>, Resend</w:t>
+      </w:r>
+      <w:r>
+        <w:t xml:space="preserve"> API</w:t>
+      </w:r>
+      <w:r>
+        <w:t xml:space="preserve"> </w:t>
+      </w:r>
     </w:p>
     <w:p>
       <w:pPr>
@@ -269,32 +297,14 @@
           <w:sz w:val="22"/>
           <w:szCs w:val="22"/>
         </w:rPr>
-        <w:t xml:space="preserve">Undergraduate Teaching </w:t>
-      </w:r>
-      <w:proofErr w:type="gramStart"/>
-      <w:r>
-        <w:rPr>
-          <w:b/>
-          <w:bCs/>
-          <w:sz w:val="22"/>
-          <w:szCs w:val="22"/>
-        </w:rPr>
-        <w:t>Assistant</w:t>
-      </w:r>
-      <w:r>
-        <w:rPr>
-          <w:sz w:val="22"/>
-          <w:szCs w:val="22"/>
-        </w:rPr>
-        <w:t xml:space="preserve">  |</w:t>
-      </w:r>
-      <w:proofErr w:type="gramEnd"/>
-      <w:r>
-        <w:rPr>
-          <w:sz w:val="22"/>
-          <w:szCs w:val="22"/>
-        </w:rPr>
-        <w:t xml:space="preserve">  </w:t>
+        <w:t>Undergraduate Teaching Assistant</w:t>
+      </w:r>
+      <w:r>
+        <w:rPr>
+          <w:sz w:val="22"/>
+          <w:szCs w:val="22"/>
+        </w:rPr>
+        <w:t xml:space="preserve">  |  </w:t>
       </w:r>
       <w:r>
         <w:rPr>
@@ -303,32 +313,14 @@
           <w:sz w:val="22"/>
           <w:szCs w:val="22"/>
         </w:rPr>
-        <w:t xml:space="preserve">University of </w:t>
-      </w:r>
-      <w:proofErr w:type="gramStart"/>
-      <w:r>
-        <w:rPr>
-          <w:i/>
-          <w:iCs/>
-          <w:sz w:val="22"/>
-          <w:szCs w:val="22"/>
-        </w:rPr>
-        <w:t>Indonesia</w:t>
-      </w:r>
-      <w:r>
-        <w:rPr>
-          <w:sz w:val="22"/>
-          <w:szCs w:val="22"/>
-        </w:rPr>
-        <w:t xml:space="preserve">  |</w:t>
-      </w:r>
-      <w:proofErr w:type="gramEnd"/>
-      <w:r>
-        <w:rPr>
-          <w:sz w:val="22"/>
-          <w:szCs w:val="22"/>
-        </w:rPr>
-        <w:t xml:space="preserve">  Depok</w:t>
+        <w:t>University of Indonesia</w:t>
+      </w:r>
+      <w:r>
+        <w:rPr>
+          <w:sz w:val="22"/>
+          <w:szCs w:val="22"/>
+        </w:rPr>
+        <w:t xml:space="preserve">  |  Depok</w:t>
       </w:r>
       <w:r>
         <w:rPr>
@@ -367,75 +359,96 @@
           <w:sz w:val="20"/>
           <w:szCs w:val="20"/>
         </w:rPr>
-        <w:t>Taught Statistics, Probability, Linear Algebra, and Calculus II to undergraduate students.</w:t>
-      </w:r>
-    </w:p>
-    <w:p>
-      <w:pPr>
-        <w:pStyle w:val="ListParagraph"/>
-        <w:numPr>
-          <w:ilvl w:val="0"/>
-          <w:numId w:val="2"/>
-        </w:numPr>
-        <w:spacing w:before="40" w:after="40"/>
-      </w:pPr>
-      <w:r>
-        <w:rPr>
-          <w:sz w:val="20"/>
-          <w:szCs w:val="20"/>
-        </w:rPr>
-        <w:t>Delivered lectures and led classroom sessions in the lecturer's absence.</w:t>
-      </w:r>
-    </w:p>
-    <w:p>
-      <w:pPr>
-        <w:pStyle w:val="ListParagraph"/>
-        <w:numPr>
-          <w:ilvl w:val="0"/>
-          <w:numId w:val="2"/>
-        </w:numPr>
-        <w:spacing w:before="40" w:after="40"/>
-      </w:pPr>
-      <w:r>
-        <w:rPr>
-          <w:sz w:val="20"/>
-          <w:szCs w:val="20"/>
-        </w:rPr>
-        <w:t>Conducted weekly tutorial and consultation sessions for students.</w:t>
-      </w:r>
-    </w:p>
-    <w:p>
-      <w:pPr>
-        <w:pStyle w:val="ListParagraph"/>
-        <w:numPr>
-          <w:ilvl w:val="0"/>
-          <w:numId w:val="2"/>
-        </w:numPr>
-        <w:spacing w:before="40" w:after="40"/>
-      </w:pPr>
-      <w:r>
-        <w:rPr>
-          <w:sz w:val="20"/>
-          <w:szCs w:val="20"/>
-        </w:rPr>
-        <w:t>Developed weekly quizzes, assignments, and examination problems.</w:t>
-      </w:r>
-    </w:p>
-    <w:p>
-      <w:pPr>
-        <w:pStyle w:val="ListParagraph"/>
-        <w:numPr>
-          <w:ilvl w:val="0"/>
-          <w:numId w:val="2"/>
-        </w:numPr>
-        <w:spacing w:before="40" w:after="40"/>
-      </w:pPr>
-      <w:r>
-        <w:rPr>
-          <w:sz w:val="20"/>
-          <w:szCs w:val="20"/>
-        </w:rPr>
-        <w:t>Graded and evaluated student assignments, quizzes, and examinations.</w:t>
+        <w:t xml:space="preserve">Teach </w:t>
+      </w:r>
+      <w:r>
+        <w:rPr>
+          <w:sz w:val="20"/>
+          <w:szCs w:val="20"/>
+        </w:rPr>
+        <w:t>Statistics, Probability, Linear Algebra, and Calculus II to undergraduate students.</w:t>
+      </w:r>
+    </w:p>
+    <w:p>
+      <w:pPr>
+        <w:pStyle w:val="ListParagraph"/>
+        <w:numPr>
+          <w:ilvl w:val="0"/>
+          <w:numId w:val="2"/>
+        </w:numPr>
+        <w:spacing w:before="40" w:after="40"/>
+      </w:pPr>
+      <w:r>
+        <w:rPr>
+          <w:sz w:val="20"/>
+          <w:szCs w:val="20"/>
+        </w:rPr>
+        <w:t>Deliver lectures and le</w:t>
+      </w:r>
+      <w:r>
+        <w:rPr>
+          <w:sz w:val="20"/>
+          <w:szCs w:val="20"/>
+        </w:rPr>
+        <w:t>a</w:t>
+      </w:r>
+      <w:r>
+        <w:rPr>
+          <w:sz w:val="20"/>
+          <w:szCs w:val="20"/>
+        </w:rPr>
+        <w:t>d classroom sessions in the lecturer's absence.</w:t>
+      </w:r>
+    </w:p>
+    <w:p>
+      <w:pPr>
+        <w:pStyle w:val="ListParagraph"/>
+        <w:numPr>
+          <w:ilvl w:val="0"/>
+          <w:numId w:val="2"/>
+        </w:numPr>
+        <w:spacing w:before="40" w:after="40"/>
+      </w:pPr>
+      <w:r>
+        <w:rPr>
+          <w:sz w:val="20"/>
+          <w:szCs w:val="20"/>
+        </w:rPr>
+        <w:t>Conduct weekly tutorial and consultation sessions for students.</w:t>
+      </w:r>
+    </w:p>
+    <w:p>
+      <w:pPr>
+        <w:pStyle w:val="ListParagraph"/>
+        <w:numPr>
+          <w:ilvl w:val="0"/>
+          <w:numId w:val="2"/>
+        </w:numPr>
+        <w:spacing w:before="40" w:after="40"/>
+      </w:pPr>
+      <w:r>
+        <w:rPr>
+          <w:sz w:val="20"/>
+          <w:szCs w:val="20"/>
+        </w:rPr>
+        <w:t>Develop weekly quizzes, assignments, and examination problems.</w:t>
+      </w:r>
+    </w:p>
+    <w:p>
+      <w:pPr>
+        <w:pStyle w:val="ListParagraph"/>
+        <w:numPr>
+          <w:ilvl w:val="0"/>
+          <w:numId w:val="2"/>
+        </w:numPr>
+        <w:spacing w:before="40" w:after="40"/>
+      </w:pPr>
+      <w:r>
+        <w:rPr>
+          <w:sz w:val="20"/>
+          <w:szCs w:val="20"/>
+        </w:rPr>
+        <w:t>Grade and evaluate student assignments, quizzes, and examinations.</w:t>
       </w:r>
     </w:p>
     <w:p>
@@ -452,9 +465,8 @@
           <w:sz w:val="22"/>
           <w:szCs w:val="22"/>
         </w:rPr>
-        <w:t xml:space="preserve">Private </w:t>
-      </w:r>
-      <w:proofErr w:type="gramStart"/>
+        <w:t>Private Tutor</w:t>
+      </w:r>
       <w:r>
         <w:rPr>
           <w:b/>
@@ -462,16 +474,164 @@
           <w:sz w:val="22"/>
           <w:szCs w:val="22"/>
         </w:rPr>
-        <w:t>Tutor</w:t>
-      </w:r>
-      <w:r>
-        <w:rPr>
-          <w:sz w:val="22"/>
-          <w:szCs w:val="22"/>
-        </w:rPr>
-        <w:t xml:space="preserve">  |</w:t>
-      </w:r>
-      <w:proofErr w:type="gramEnd"/>
+        <w:t xml:space="preserve"> (Part Time)</w:t>
+      </w:r>
+      <w:r>
+        <w:rPr>
+          <w:sz w:val="22"/>
+          <w:szCs w:val="22"/>
+        </w:rPr>
+        <w:t xml:space="preserve">                                        </w:t>
+      </w:r>
+      <w:r>
+        <w:rPr>
+          <w:sz w:val="22"/>
+          <w:szCs w:val="22"/>
+        </w:rPr>
+        <w:t xml:space="preserve"> </w:t>
+      </w:r>
+      <w:r>
+        <w:rPr>
+          <w:sz w:val="22"/>
+          <w:szCs w:val="22"/>
+        </w:rPr>
+        <w:t xml:space="preserve"> </w:t>
+      </w:r>
+      <w:r>
+        <w:rPr>
+          <w:sz w:val="22"/>
+          <w:szCs w:val="22"/>
+        </w:rPr>
+        <w:t xml:space="preserve"> </w:t>
+      </w:r>
+      <w:r>
+        <w:rPr>
+          <w:sz w:val="22"/>
+          <w:szCs w:val="22"/>
+        </w:rPr>
+        <w:t xml:space="preserve">                                         </w:t>
+      </w:r>
+      <w:r>
+        <w:rPr>
+          <w:color w:val="555555"/>
+          <w:sz w:val="20"/>
+          <w:szCs w:val="20"/>
+        </w:rPr>
+        <w:t>November 2023 – Present</w:t>
+      </w:r>
+    </w:p>
+    <w:p>
+      <w:pPr>
+        <w:pStyle w:val="ListParagraph"/>
+        <w:numPr>
+          <w:ilvl w:val="0"/>
+          <w:numId w:val="2"/>
+        </w:numPr>
+        <w:spacing w:before="40" w:after="40"/>
+        <w:rPr>
+          <w:sz w:val="20"/>
+          <w:szCs w:val="20"/>
+        </w:rPr>
+      </w:pPr>
+      <w:r>
+        <w:rPr>
+          <w:sz w:val="20"/>
+          <w:szCs w:val="20"/>
+        </w:rPr>
+        <w:t>Serve as a long-term paid private tutor for two students for over two years.</w:t>
+      </w:r>
+    </w:p>
+    <w:p>
+      <w:pPr>
+        <w:pStyle w:val="ListParagraph"/>
+        <w:numPr>
+          <w:ilvl w:val="0"/>
+          <w:numId w:val="2"/>
+        </w:numPr>
+        <w:spacing w:before="40" w:after="40"/>
+        <w:rPr>
+          <w:sz w:val="20"/>
+          <w:szCs w:val="20"/>
+        </w:rPr>
+      </w:pPr>
+      <w:r>
+        <w:rPr>
+          <w:sz w:val="20"/>
+          <w:szCs w:val="20"/>
+        </w:rPr>
+        <w:t xml:space="preserve">Teach </w:t>
+      </w:r>
+      <w:r>
+        <w:rPr>
+          <w:sz w:val="20"/>
+          <w:szCs w:val="20"/>
+        </w:rPr>
+        <w:t>university-level courses including Foundations of Programming, Object-Oriented Programming, Database Systems, Computer Architecture, Operating Systems, Accounting, and Enterprise Systems Fundamentals.</w:t>
+      </w:r>
+    </w:p>
+    <w:p>
+      <w:pPr>
+        <w:pStyle w:val="ListParagraph"/>
+        <w:numPr>
+          <w:ilvl w:val="0"/>
+          <w:numId w:val="2"/>
+        </w:numPr>
+        <w:spacing w:before="40" w:after="40"/>
+      </w:pPr>
+      <w:r>
+        <w:rPr>
+          <w:sz w:val="20"/>
+          <w:szCs w:val="20"/>
+        </w:rPr>
+        <w:t xml:space="preserve">Provide </w:t>
+      </w:r>
+      <w:r>
+        <w:rPr>
+          <w:sz w:val="20"/>
+          <w:szCs w:val="20"/>
+        </w:rPr>
+        <w:t>one-on-one academic mentoring, problem-solving guidance, and exam preparation support.</w:t>
+      </w:r>
+    </w:p>
+    <w:p>
+      <w:pPr>
+        <w:tabs>
+          <w:tab w:val="right" w:pos="9360"/>
+        </w:tabs>
+        <w:spacing w:before="160" w:after="40"/>
+      </w:pPr>
+      <w:r>
+        <w:rPr>
+          <w:b/>
+          <w:bCs/>
+          <w:sz w:val="22"/>
+          <w:szCs w:val="22"/>
+        </w:rPr>
+        <w:t>Frontend Developer</w:t>
+      </w:r>
+      <w:r>
+        <w:rPr>
+          <w:sz w:val="22"/>
+          <w:szCs w:val="22"/>
+        </w:rPr>
+        <w:t xml:space="preserve"> </w:t>
+      </w:r>
+      <w:r>
+        <w:rPr>
+          <w:b/>
+          <w:bCs/>
+          <w:sz w:val="22"/>
+          <w:szCs w:val="22"/>
+        </w:rPr>
+        <w:t xml:space="preserve">(Volunteer) </w:t>
+      </w:r>
+      <w:r>
+        <w:rPr>
+          <w:sz w:val="22"/>
+          <w:szCs w:val="22"/>
+        </w:rPr>
+        <w:t xml:space="preserve"> |</w:t>
+      </w:r>
       <w:r>
         <w:rPr>
           <w:sz w:val="22"/>
@@ -486,35 +646,21 @@
           <w:sz w:val="22"/>
           <w:szCs w:val="22"/>
         </w:rPr>
-        <w:t>Freelance / Part-time</w:t>
-      </w:r>
-      <w:r>
-        <w:rPr>
-          <w:sz w:val="22"/>
-          <w:szCs w:val="22"/>
-        </w:rPr>
-        <w:t xml:space="preserve">  </w:t>
-      </w:r>
-      <w:r>
-        <w:rPr>
-          <w:sz w:val="22"/>
-          <w:szCs w:val="22"/>
-        </w:rPr>
-        <w:t xml:space="preserve"> </w:t>
-      </w:r>
-      <w:r>
-        <w:rPr>
-          <w:sz w:val="22"/>
-          <w:szCs w:val="22"/>
-        </w:rPr>
-        <w:t xml:space="preserve"> </w:t>
-      </w:r>
-      <w:r>
-        <w:rPr>
-          <w:sz w:val="22"/>
-          <w:szCs w:val="22"/>
-        </w:rPr>
-        <w:t xml:space="preserve">                                                             </w:t>
+        <w:t xml:space="preserve">GSJA Betlehem  </w:t>
+      </w:r>
+      <w:r>
+        <w:rPr>
+          <w:sz w:val="22"/>
+          <w:szCs w:val="22"/>
+        </w:rPr>
+        <w:t>|  Bogor</w:t>
+      </w:r>
+      <w:r>
+        <w:rPr>
+          <w:sz w:val="22"/>
+          <w:szCs w:val="22"/>
+        </w:rPr>
+        <w:t xml:space="preserve">                          </w:t>
       </w:r>
       <w:r>
         <w:rPr>
@@ -522,66 +668,73 @@
           <w:sz w:val="20"/>
           <w:szCs w:val="20"/>
         </w:rPr>
-        <w:t>November 2023 – Present</w:t>
-      </w:r>
-    </w:p>
-    <w:p>
-      <w:pPr>
-        <w:pStyle w:val="ListParagraph"/>
-        <w:numPr>
-          <w:ilvl w:val="0"/>
-          <w:numId w:val="2"/>
-        </w:numPr>
-        <w:spacing w:before="40" w:after="40"/>
-        <w:rPr>
-          <w:sz w:val="20"/>
-          <w:szCs w:val="20"/>
-        </w:rPr>
-      </w:pPr>
-      <w:r>
-        <w:rPr>
-          <w:sz w:val="20"/>
-          <w:szCs w:val="20"/>
-        </w:rPr>
-        <w:t>Served as a long-term paid private tutor for two students for over two years.</w:t>
-      </w:r>
-    </w:p>
-    <w:p>
-      <w:pPr>
-        <w:pStyle w:val="ListParagraph"/>
-        <w:numPr>
-          <w:ilvl w:val="0"/>
-          <w:numId w:val="2"/>
-        </w:numPr>
-        <w:spacing w:before="40" w:after="40"/>
-        <w:rPr>
-          <w:sz w:val="20"/>
-          <w:szCs w:val="20"/>
-        </w:rPr>
-      </w:pPr>
-      <w:r>
-        <w:rPr>
-          <w:sz w:val="20"/>
-          <w:szCs w:val="20"/>
-        </w:rPr>
-        <w:t>Taught university-level courses including Foundations of Programming, Object-Oriented Programming, Database Systems, Computer Architecture, Operating Systems, Accounting, and Enterprise Systems Fundamentals.</w:t>
-      </w:r>
-    </w:p>
-    <w:p>
-      <w:pPr>
-        <w:pStyle w:val="ListParagraph"/>
-        <w:numPr>
-          <w:ilvl w:val="0"/>
-          <w:numId w:val="2"/>
-        </w:numPr>
-        <w:spacing w:before="40" w:after="40"/>
-      </w:pPr>
-      <w:r>
-        <w:rPr>
-          <w:sz w:val="20"/>
-          <w:szCs w:val="20"/>
-        </w:rPr>
-        <w:t xml:space="preserve">Provided one-on-one academic mentoring, problem-solving guidance, and exam preparation support. </w:t>
+        <w:t>September</w:t>
+      </w:r>
+      <w:r>
+        <w:rPr>
+          <w:color w:val="555555"/>
+          <w:sz w:val="20"/>
+          <w:szCs w:val="20"/>
+        </w:rPr>
+        <w:t xml:space="preserve"> 202</w:t>
+      </w:r>
+      <w:r>
+        <w:rPr>
+          <w:color w:val="555555"/>
+          <w:sz w:val="20"/>
+          <w:szCs w:val="20"/>
+        </w:rPr>
+        <w:t>4</w:t>
+      </w:r>
+      <w:r>
+        <w:rPr>
+          <w:color w:val="555555"/>
+          <w:sz w:val="20"/>
+          <w:szCs w:val="20"/>
+        </w:rPr>
+        <w:t xml:space="preserve"> – Present</w:t>
+      </w:r>
+    </w:p>
+    <w:p>
+      <w:pPr>
+        <w:pStyle w:val="ListParagraph"/>
+        <w:numPr>
+          <w:ilvl w:val="0"/>
+          <w:numId w:val="2"/>
+        </w:numPr>
+        <w:spacing w:before="40" w:after="40"/>
+        <w:rPr>
+          <w:sz w:val="20"/>
+          <w:szCs w:val="20"/>
+        </w:rPr>
+      </w:pPr>
+      <w:r>
+        <w:rPr>
+          <w:sz w:val="20"/>
+          <w:szCs w:val="20"/>
+        </w:rPr>
+        <w:t>Develop and maintain the frontend of the church’s official website.</w:t>
+      </w:r>
+    </w:p>
+    <w:p>
+      <w:pPr>
+        <w:pStyle w:val="ListParagraph"/>
+        <w:numPr>
+          <w:ilvl w:val="0"/>
+          <w:numId w:val="2"/>
+        </w:numPr>
+        <w:spacing w:before="40" w:after="40"/>
+        <w:rPr>
+          <w:sz w:val="20"/>
+          <w:szCs w:val="20"/>
+        </w:rPr>
+      </w:pPr>
+      <w:r>
+        <w:rPr>
+          <w:sz w:val="20"/>
+          <w:szCs w:val="20"/>
+        </w:rPr>
+        <w:t>Implement website features and interface improvements based on designs and requirements provided by the UI/UX team.</w:t>
       </w:r>
     </w:p>
     <w:p>
@@ -671,17 +824,7 @@
           <w:sz w:val="22"/>
           <w:szCs w:val="22"/>
         </w:rPr>
-        <w:t>Garam Enterprise &amp; Analytics Resource (</w:t>
-      </w:r>
-      <w:proofErr w:type="gramStart"/>
-      <w:r>
-        <w:rPr>
-          <w:b/>
-          <w:bCs/>
-          <w:sz w:val="22"/>
-          <w:szCs w:val="22"/>
-        </w:rPr>
-        <w:t>GEAR)</w:t>
+        <w:t>Garam Enterprise &amp; Analytics Resource (GEAR)</w:t>
       </w:r>
       <w:r>
         <w:rPr>
@@ -689,137 +832,330 @@
           <w:iCs/>
           <w:color w:val="444444"/>
         </w:rPr>
-        <w:t xml:space="preserve">  |</w:t>
-      </w:r>
-      <w:proofErr w:type="gramEnd"/>
+        <w:t xml:space="preserve">  |  Lead Developer</w:t>
+      </w:r>
+    </w:p>
+    <w:p>
+      <w:pPr>
+        <w:pStyle w:val="ListParagraph"/>
+        <w:numPr>
+          <w:ilvl w:val="0"/>
+          <w:numId w:val="2"/>
+        </w:numPr>
+        <w:spacing w:before="40" w:after="40"/>
+      </w:pPr>
+      <w:r>
+        <w:rPr>
+          <w:sz w:val="20"/>
+          <w:szCs w:val="20"/>
+        </w:rPr>
+        <w:t xml:space="preserve">Led a small development team under University of Indonesia supervision to build a custom ERP system </w:t>
+      </w:r>
+      <w:r>
+        <w:rPr>
+          <w:sz w:val="20"/>
+          <w:szCs w:val="20"/>
+        </w:rPr>
+        <w:t xml:space="preserve">with a permission-based access </w:t>
+      </w:r>
+      <w:r>
+        <w:rPr>
+          <w:sz w:val="20"/>
+          <w:szCs w:val="20"/>
+        </w:rPr>
+        <w:t>for a manufacturing and salt distribution company in Lampung, Indonesia</w:t>
+      </w:r>
+      <w:r>
+        <w:rPr>
+          <w:sz w:val="20"/>
+          <w:szCs w:val="20"/>
+        </w:rPr>
+        <w:t xml:space="preserve">, used by </w:t>
+      </w:r>
+      <w:r>
+        <w:rPr>
+          <w:sz w:val="20"/>
+          <w:szCs w:val="20"/>
+        </w:rPr>
+        <w:t xml:space="preserve">over </w:t>
+      </w:r>
+      <w:r>
+        <w:rPr>
+          <w:sz w:val="20"/>
+          <w:szCs w:val="20"/>
+        </w:rPr>
+        <w:t>30 employees.</w:t>
+      </w:r>
+    </w:p>
+    <w:p>
+      <w:pPr>
+        <w:pStyle w:val="ListParagraph"/>
+        <w:numPr>
+          <w:ilvl w:val="0"/>
+          <w:numId w:val="2"/>
+        </w:numPr>
+        <w:spacing w:before="40" w:after="40"/>
+      </w:pPr>
+      <w:r>
+        <w:rPr>
+          <w:sz w:val="20"/>
+          <w:szCs w:val="20"/>
+        </w:rPr>
+        <w:lastRenderedPageBreak/>
+        <w:t>Designed and developed procurement, inventory, sales, finance, and analytics modules that digitized paper-based workflows, reduced manual errors, provided automated audit trails, and significantly accelerated business processes.</w:t>
+      </w:r>
+    </w:p>
+    <w:p>
+      <w:pPr>
+        <w:pStyle w:val="ListParagraph"/>
+        <w:numPr>
+          <w:ilvl w:val="0"/>
+          <w:numId w:val="2"/>
+        </w:numPr>
+        <w:spacing w:before="40" w:after="40"/>
+      </w:pPr>
+      <w:r>
+        <w:rPr>
+          <w:sz w:val="20"/>
+          <w:szCs w:val="20"/>
+        </w:rPr>
+        <w:t>Implemented account recovery</w:t>
+      </w:r>
+      <w:r>
+        <w:rPr>
+          <w:sz w:val="20"/>
+          <w:szCs w:val="20"/>
+        </w:rPr>
+        <w:t xml:space="preserve"> (forget password)</w:t>
+      </w:r>
+      <w:r>
+        <w:rPr>
+          <w:sz w:val="20"/>
+          <w:szCs w:val="20"/>
+        </w:rPr>
+        <w:t xml:space="preserve"> workflow using Resend email service</w:t>
+      </w:r>
+      <w:r>
+        <w:rPr>
+          <w:sz w:val="20"/>
+          <w:szCs w:val="20"/>
+        </w:rPr>
+        <w:t>.</w:t>
+      </w:r>
+    </w:p>
+    <w:p>
+      <w:pPr>
+        <w:pStyle w:val="ListParagraph"/>
+        <w:numPr>
+          <w:ilvl w:val="0"/>
+          <w:numId w:val="2"/>
+        </w:numPr>
+        <w:spacing w:before="40" w:after="40"/>
+      </w:pPr>
+      <w:r>
+        <w:t xml:space="preserve">Implemented a </w:t>
+      </w:r>
+      <w:r>
+        <w:t>permission</w:t>
+      </w:r>
+      <w:r>
+        <w:t>-based WhatsApp chatbot</w:t>
+      </w:r>
+      <w:r>
+        <w:t xml:space="preserve"> using Twilio and webhook</w:t>
+      </w:r>
+      <w:r>
+        <w:t xml:space="preserve"> that provided an intuitive interface for employees with limited technical literacy</w:t>
+      </w:r>
+      <w:r>
+        <w:t>, integrated with Gemini LLM API.</w:t>
+      </w:r>
+    </w:p>
+    <w:p>
+      <w:pPr>
+        <w:pStyle w:val="ListParagraph"/>
+        <w:numPr>
+          <w:ilvl w:val="0"/>
+          <w:numId w:val="2"/>
+        </w:numPr>
+        <w:spacing w:before="40" w:after="40"/>
+      </w:pPr>
+      <w:r>
+        <w:t xml:space="preserve">Deployed and maintained the production system on a Linux-based </w:t>
+      </w:r>
+      <w:proofErr w:type="spellStart"/>
+      <w:r>
+        <w:t>DigitalOcean</w:t>
+      </w:r>
+      <w:proofErr w:type="spellEnd"/>
+      <w:r>
+        <w:t xml:space="preserve"> server using </w:t>
+      </w:r>
+      <w:proofErr w:type="spellStart"/>
+      <w:r>
+        <w:t>Gunicorn</w:t>
+      </w:r>
+      <w:proofErr w:type="spellEnd"/>
+      <w:r>
+        <w:t>, Nginx, and PostgreSQL.</w:t>
+      </w:r>
+    </w:p>
+    <w:p>
+      <w:pPr>
+        <w:spacing w:before="160" w:after="40"/>
+      </w:pPr>
+      <w:proofErr w:type="spellStart"/>
+      <w:r>
+        <w:rPr>
+          <w:b/>
+          <w:bCs/>
+          <w:sz w:val="22"/>
+          <w:szCs w:val="22"/>
+        </w:rPr>
+        <w:t>TravelAPAP</w:t>
+      </w:r>
+      <w:proofErr w:type="spellEnd"/>
       <w:r>
         <w:rPr>
           <w:i/>
           <w:iCs/>
           <w:color w:val="444444"/>
         </w:rPr>
-        <w:t xml:space="preserve">  Lead Developer</w:t>
-      </w:r>
-    </w:p>
-    <w:p>
-      <w:pPr>
-        <w:pStyle w:val="ListParagraph"/>
-        <w:numPr>
-          <w:ilvl w:val="0"/>
-          <w:numId w:val="2"/>
-        </w:numPr>
-        <w:spacing w:before="40" w:after="40"/>
-      </w:pPr>
-      <w:r>
-        <w:rPr>
-          <w:sz w:val="20"/>
-          <w:szCs w:val="20"/>
-        </w:rPr>
-        <w:t xml:space="preserve">Led a small development team under University of Indonesia supervision to build a custom ERP system </w:t>
-      </w:r>
-      <w:r>
-        <w:rPr>
-          <w:sz w:val="20"/>
-          <w:szCs w:val="20"/>
-        </w:rPr>
-        <w:t xml:space="preserve">with a permission-based access </w:t>
-      </w:r>
-      <w:r>
-        <w:rPr>
-          <w:sz w:val="20"/>
-          <w:szCs w:val="20"/>
-        </w:rPr>
-        <w:t>for a manufacturing and salt distribution company in Lampung, Indonesia</w:t>
-      </w:r>
-      <w:r>
-        <w:rPr>
-          <w:sz w:val="20"/>
-          <w:szCs w:val="20"/>
-        </w:rPr>
-        <w:t xml:space="preserve">, used by </w:t>
-      </w:r>
-      <w:r>
-        <w:rPr>
-          <w:sz w:val="20"/>
-          <w:szCs w:val="20"/>
-        </w:rPr>
-        <w:t xml:space="preserve">over </w:t>
-      </w:r>
-      <w:r>
-        <w:rPr>
-          <w:sz w:val="20"/>
-          <w:szCs w:val="20"/>
-        </w:rPr>
-        <w:t>30 employees.</w:t>
-      </w:r>
-    </w:p>
-    <w:p>
-      <w:pPr>
-        <w:pStyle w:val="ListParagraph"/>
-        <w:numPr>
-          <w:ilvl w:val="0"/>
-          <w:numId w:val="2"/>
-        </w:numPr>
-        <w:spacing w:before="40" w:after="40"/>
-      </w:pPr>
-      <w:r>
-        <w:rPr>
-          <w:sz w:val="20"/>
-          <w:szCs w:val="20"/>
-        </w:rPr>
-        <w:t>Designed and developed procurement, inventory, sales, finance, and analytics modules that digitized paper-based workflows, reduced manual errors, provided automated audit trails, and significantly accelerated business processes.</w:t>
-      </w:r>
-    </w:p>
-    <w:p>
-      <w:pPr>
-        <w:pStyle w:val="ListParagraph"/>
-        <w:numPr>
-          <w:ilvl w:val="0"/>
-          <w:numId w:val="2"/>
-        </w:numPr>
-        <w:spacing w:before="40" w:after="40"/>
-      </w:pPr>
-      <w:r>
-        <w:t xml:space="preserve">Implemented a </w:t>
-      </w:r>
-      <w:r>
-        <w:t>permission</w:t>
-      </w:r>
-      <w:r>
-        <w:t>-based WhatsApp chatbot that provided an intuitive interface for employees with limited technical literacy</w:t>
-      </w:r>
-      <w:r>
-        <w:t>, integrated with Gemini LLM API.</w:t>
-      </w:r>
-    </w:p>
-    <w:p>
-      <w:pPr>
-        <w:pStyle w:val="ListParagraph"/>
-        <w:numPr>
-          <w:ilvl w:val="0"/>
-          <w:numId w:val="2"/>
-        </w:numPr>
-        <w:spacing w:before="40" w:after="40"/>
-      </w:pPr>
-      <w:r>
-        <w:lastRenderedPageBreak/>
-        <w:t xml:space="preserve">Deployed and maintained the production system on a Linux-based </w:t>
-      </w:r>
-      <w:proofErr w:type="spellStart"/>
-      <w:r>
-        <w:t>DigitalOcean</w:t>
-      </w:r>
-      <w:proofErr w:type="spellEnd"/>
-      <w:r>
-        <w:t xml:space="preserve"> server using </w:t>
-      </w:r>
-      <w:proofErr w:type="spellStart"/>
-      <w:r>
-        <w:t>Gunicorn</w:t>
-      </w:r>
-      <w:proofErr w:type="spellEnd"/>
-      <w:r>
-        <w:t>, Nginx, and PostgreSQL.</w:t>
+        <w:t xml:space="preserve">  |  Campus Course Project</w:t>
+      </w:r>
+    </w:p>
+    <w:p>
+      <w:pPr>
+        <w:pStyle w:val="ListParagraph"/>
+        <w:numPr>
+          <w:ilvl w:val="0"/>
+          <w:numId w:val="2"/>
+        </w:numPr>
+        <w:spacing w:before="40" w:after="40"/>
+      </w:pPr>
+      <w:r>
+        <w:rPr>
+          <w:sz w:val="20"/>
+          <w:szCs w:val="20"/>
+        </w:rPr>
+        <w:t>Developed a microservice-based tour package management system enabling vendors to create packages by integrating flights, accommodations, and tourist attractions from partner services.</w:t>
+      </w:r>
+    </w:p>
+    <w:p>
+      <w:pPr>
+        <w:pStyle w:val="ListParagraph"/>
+        <w:numPr>
+          <w:ilvl w:val="0"/>
+          <w:numId w:val="2"/>
+        </w:numPr>
+        <w:spacing w:before="40" w:after="40"/>
+      </w:pPr>
+      <w:r>
+        <w:rPr>
+          <w:sz w:val="20"/>
+          <w:szCs w:val="20"/>
+        </w:rPr>
+        <w:t>Implemented customer-facing workflows for browsing and ordering tour packages through distributed microservice interactions.</w:t>
+      </w:r>
+    </w:p>
+    <w:p>
+      <w:pPr>
+        <w:pStyle w:val="ListParagraph"/>
+        <w:numPr>
+          <w:ilvl w:val="0"/>
+          <w:numId w:val="2"/>
+        </w:numPr>
+        <w:spacing w:before="40" w:after="40"/>
+      </w:pPr>
+      <w:r>
+        <w:rPr>
+          <w:sz w:val="20"/>
+          <w:szCs w:val="20"/>
+        </w:rPr>
+        <w:t>Built a dedicated authentication and authorization microservice using OAuth 2.0 and JWT, consumed by peer microservices within the same course project.</w:t>
+      </w:r>
+    </w:p>
+    <w:p>
+      <w:pPr>
+        <w:pStyle w:val="ListParagraph"/>
+        <w:numPr>
+          <w:ilvl w:val="0"/>
+          <w:numId w:val="2"/>
+        </w:numPr>
+        <w:spacing w:before="40" w:after="40"/>
+      </w:pPr>
+      <w:r>
+        <w:rPr>
+          <w:sz w:val="20"/>
+          <w:szCs w:val="20"/>
+        </w:rPr>
+        <w:t>Implemented Single Sign-On (SSO) to provide seamless authentication persistence across multiple microservices.</w:t>
+      </w:r>
+    </w:p>
+    <w:p>
+      <w:pPr>
+        <w:pStyle w:val="ListParagraph"/>
+        <w:numPr>
+          <w:ilvl w:val="0"/>
+          <w:numId w:val="2"/>
+        </w:numPr>
+        <w:spacing w:before="40" w:after="40"/>
+      </w:pPr>
+      <w:r>
+        <w:rPr>
+          <w:sz w:val="20"/>
+          <w:szCs w:val="20"/>
+        </w:rPr>
+        <w:t xml:space="preserve">Deployed the microservices using </w:t>
+      </w:r>
+      <w:r>
+        <w:rPr>
+          <w:sz w:val="20"/>
+          <w:szCs w:val="20"/>
+        </w:rPr>
+        <w:t xml:space="preserve">AWS </w:t>
+      </w:r>
+      <w:r>
+        <w:rPr>
+          <w:sz w:val="20"/>
+          <w:szCs w:val="20"/>
+        </w:rPr>
+        <w:t xml:space="preserve">EC2, </w:t>
+      </w:r>
+      <w:r>
+        <w:rPr>
+          <w:sz w:val="20"/>
+          <w:szCs w:val="20"/>
+        </w:rPr>
+        <w:t>Docker</w:t>
+      </w:r>
+      <w:r>
+        <w:rPr>
+          <w:sz w:val="20"/>
+          <w:szCs w:val="20"/>
+        </w:rPr>
+        <w:t>,</w:t>
+      </w:r>
+      <w:r>
+        <w:rPr>
+          <w:sz w:val="20"/>
+          <w:szCs w:val="20"/>
+        </w:rPr>
+        <w:t xml:space="preserve"> </w:t>
+      </w:r>
+      <w:r>
+        <w:rPr>
+          <w:sz w:val="20"/>
+          <w:szCs w:val="20"/>
+        </w:rPr>
+        <w:t>and Kubernetes</w:t>
+      </w:r>
+      <w:r>
+        <w:rPr>
+          <w:sz w:val="20"/>
+          <w:szCs w:val="20"/>
+        </w:rPr>
+        <w:t>.</w:t>
       </w:r>
     </w:p>
     <w:p>
@@ -833,17 +1169,7 @@
           <w:sz w:val="22"/>
           <w:szCs w:val="22"/>
         </w:rPr>
-        <w:t>Mini Enterprise System (</w:t>
-      </w:r>
-      <w:proofErr w:type="gramStart"/>
-      <w:r>
-        <w:rPr>
-          <w:b/>
-          <w:bCs/>
-          <w:sz w:val="22"/>
-          <w:szCs w:val="22"/>
-        </w:rPr>
-        <w:t>MINES)</w:t>
+        <w:t>Silver Screen</w:t>
       </w:r>
       <w:r>
         <w:rPr>
@@ -851,341 +1177,166 @@
           <w:iCs/>
           <w:color w:val="444444"/>
         </w:rPr>
-        <w:t xml:space="preserve">  |</w:t>
-      </w:r>
-      <w:proofErr w:type="gramEnd"/>
-      <w:r>
-        <w:rPr>
-          <w:i/>
-          <w:iCs/>
-          <w:color w:val="444444"/>
-        </w:rPr>
-        <w:t xml:space="preserve">  Hobby Project</w:t>
-      </w:r>
-    </w:p>
-    <w:p>
-      <w:pPr>
-        <w:pStyle w:val="ListParagraph"/>
-        <w:numPr>
-          <w:ilvl w:val="0"/>
-          <w:numId w:val="2"/>
-        </w:numPr>
-        <w:spacing w:before="40" w:after="40"/>
-      </w:pPr>
-      <w:r>
-        <w:rPr>
-          <w:sz w:val="20"/>
-          <w:szCs w:val="20"/>
-        </w:rPr>
-        <w:t xml:space="preserve">Developed an independent ERP platform inspired by GEAR to explore enterprise system architecture and business process </w:t>
+        <w:t xml:space="preserve">  |  Hobby Project</w:t>
+      </w:r>
+    </w:p>
+    <w:p>
+      <w:pPr>
+        <w:pStyle w:val="ListParagraph"/>
+        <w:numPr>
+          <w:ilvl w:val="0"/>
+          <w:numId w:val="2"/>
+        </w:numPr>
+        <w:spacing w:before="40" w:after="40"/>
+      </w:pPr>
+      <w:r>
+        <w:rPr>
+          <w:sz w:val="20"/>
+          <w:szCs w:val="20"/>
+        </w:rPr>
+        <w:t>Developed a cinema ticketing and operations management system supporting both customer-facing and internal business workflows</w:t>
+      </w:r>
+      <w:r>
+        <w:rPr>
+          <w:sz w:val="20"/>
+          <w:szCs w:val="20"/>
+        </w:rPr>
+        <w:t xml:space="preserve"> with role</w:t>
+      </w:r>
+      <w:r>
+        <w:rPr>
+          <w:sz w:val="20"/>
+          <w:szCs w:val="20"/>
+        </w:rPr>
+        <w:t>-</w:t>
+      </w:r>
+      <w:r>
+        <w:rPr>
+          <w:sz w:val="20"/>
+          <w:szCs w:val="20"/>
+        </w:rPr>
+        <w:t>based access</w:t>
+      </w:r>
+      <w:r>
+        <w:rPr>
+          <w:sz w:val="20"/>
+          <w:szCs w:val="20"/>
+        </w:rPr>
+        <w:t>.</w:t>
+      </w:r>
+    </w:p>
+    <w:p>
+      <w:pPr>
+        <w:pStyle w:val="ListParagraph"/>
+        <w:numPr>
+          <w:ilvl w:val="0"/>
+          <w:numId w:val="2"/>
+        </w:numPr>
+        <w:spacing w:before="40" w:after="40"/>
+      </w:pPr>
+      <w:r>
+        <w:rPr>
+          <w:sz w:val="20"/>
+          <w:szCs w:val="20"/>
+        </w:rPr>
+        <w:t>Implemented an online ticket booking platform with seat selection and order management capabilities for customers.</w:t>
+      </w:r>
+    </w:p>
+    <w:p>
+      <w:pPr>
+        <w:pStyle w:val="ListParagraph"/>
+        <w:numPr>
+          <w:ilvl w:val="0"/>
+          <w:numId w:val="2"/>
+        </w:numPr>
+        <w:spacing w:before="40" w:after="40"/>
+      </w:pPr>
+      <w:r>
+        <w:rPr>
+          <w:sz w:val="20"/>
+          <w:szCs w:val="20"/>
+        </w:rPr>
+        <w:t>Integrated a payment gateway interface for processing and validating online ticket purchases through a payment gateway stub.</w:t>
+      </w:r>
+    </w:p>
+    <w:p>
+      <w:pPr>
+        <w:pStyle w:val="ListParagraph"/>
+        <w:numPr>
+          <w:ilvl w:val="0"/>
+          <w:numId w:val="2"/>
+        </w:numPr>
+        <w:spacing w:before="40" w:after="40"/>
+      </w:pPr>
+      <w:r>
+        <w:rPr>
+          <w:sz w:val="20"/>
+          <w:szCs w:val="20"/>
+        </w:rPr>
+        <w:t>Designed a point-of-sale (POS) workflow for staff to manage and process onsite ticket transactions.</w:t>
+      </w:r>
+    </w:p>
+    <w:p>
+      <w:pPr>
+        <w:pStyle w:val="ListParagraph"/>
+        <w:numPr>
+          <w:ilvl w:val="0"/>
+          <w:numId w:val="2"/>
+        </w:numPr>
+        <w:spacing w:before="40" w:after="40"/>
+      </w:pPr>
+      <w:r>
+        <w:rPr>
+          <w:sz w:val="20"/>
+          <w:szCs w:val="20"/>
+        </w:rPr>
+        <w:t>Developed scheduling functionality for managing movie showtimes and screening availability.</w:t>
+      </w:r>
+    </w:p>
+    <w:p>
+      <w:pPr>
+        <w:pStyle w:val="ListParagraph"/>
+        <w:numPr>
+          <w:ilvl w:val="0"/>
+          <w:numId w:val="2"/>
+        </w:numPr>
+        <w:spacing w:before="40" w:after="40"/>
+      </w:pPr>
+      <w:r>
+        <w:rPr>
+          <w:sz w:val="20"/>
+          <w:szCs w:val="20"/>
+        </w:rPr>
+        <w:t>Built master data management features for maintaining studios, movies, and related operational data.</w:t>
+      </w:r>
+    </w:p>
+    <w:p>
+      <w:pPr>
+        <w:pStyle w:val="ListParagraph"/>
+        <w:numPr>
+          <w:ilvl w:val="0"/>
+          <w:numId w:val="2"/>
+        </w:numPr>
+        <w:spacing w:before="40" w:after="40"/>
+      </w:pPr>
+      <w:r>
+        <w:t xml:space="preserve">Deployed and maintained the production system on a Linux-based </w:t>
       </w:r>
       <w:proofErr w:type="spellStart"/>
       <w:r>
-        <w:rPr>
-          <w:sz w:val="20"/>
-          <w:szCs w:val="20"/>
-        </w:rPr>
-        <w:t>modeling</w:t>
+        <w:t>DigitalOcean</w:t>
       </w:r>
       <w:proofErr w:type="spellEnd"/>
       <w:r>
-        <w:rPr>
-          <w:sz w:val="20"/>
-          <w:szCs w:val="20"/>
-        </w:rPr>
-        <w:t>.</w:t>
-      </w:r>
-    </w:p>
-    <w:p>
-      <w:pPr>
-        <w:pStyle w:val="ListParagraph"/>
-        <w:numPr>
-          <w:ilvl w:val="0"/>
-          <w:numId w:val="2"/>
-        </w:numPr>
-        <w:spacing w:before="40" w:after="40"/>
-      </w:pPr>
-      <w:r>
-        <w:rPr>
-          <w:sz w:val="20"/>
-          <w:szCs w:val="20"/>
-        </w:rPr>
-        <w:t>Redesigned core workflows and domain models to support a broader range of business processes across multiple industries.</w:t>
-      </w:r>
-    </w:p>
-    <w:p>
-      <w:pPr>
-        <w:spacing w:before="160" w:after="40"/>
-      </w:pPr>
+        <w:t xml:space="preserve"> server using </w:t>
+      </w:r>
       <w:proofErr w:type="spellStart"/>
-      <w:proofErr w:type="gramStart"/>
-      <w:r>
-        <w:rPr>
-          <w:b/>
-          <w:bCs/>
-          <w:sz w:val="22"/>
-          <w:szCs w:val="22"/>
-        </w:rPr>
-        <w:t>TravelAPAP</w:t>
+      <w:r>
+        <w:t>Gunicorn</w:t>
       </w:r>
       <w:proofErr w:type="spellEnd"/>
       <w:r>
-        <w:rPr>
-          <w:i/>
-          <w:iCs/>
-          <w:color w:val="444444"/>
-        </w:rPr>
-        <w:t xml:space="preserve">  |</w:t>
-      </w:r>
-      <w:proofErr w:type="gramEnd"/>
-      <w:r>
-        <w:rPr>
-          <w:i/>
-          <w:iCs/>
-          <w:color w:val="444444"/>
-        </w:rPr>
-        <w:t xml:space="preserve">  Campus Course Project</w:t>
-      </w:r>
-    </w:p>
-    <w:p>
-      <w:pPr>
-        <w:pStyle w:val="ListParagraph"/>
-        <w:numPr>
-          <w:ilvl w:val="0"/>
-          <w:numId w:val="2"/>
-        </w:numPr>
-        <w:spacing w:before="40" w:after="40"/>
-      </w:pPr>
-      <w:r>
-        <w:rPr>
-          <w:sz w:val="20"/>
-          <w:szCs w:val="20"/>
-        </w:rPr>
-        <w:t>Developed a microservice-based tour package management system enabling vendors to create packages by integrating flights, accommodations, and tourist attractions from partner services.</w:t>
-      </w:r>
-    </w:p>
-    <w:p>
-      <w:pPr>
-        <w:pStyle w:val="ListParagraph"/>
-        <w:numPr>
-          <w:ilvl w:val="0"/>
-          <w:numId w:val="2"/>
-        </w:numPr>
-        <w:spacing w:before="40" w:after="40"/>
-      </w:pPr>
-      <w:r>
-        <w:rPr>
-          <w:sz w:val="20"/>
-          <w:szCs w:val="20"/>
-        </w:rPr>
-        <w:t>Implemented customer-facing workflows for browsing and ordering tour packages through distributed microservice interactions.</w:t>
-      </w:r>
-    </w:p>
-    <w:p>
-      <w:pPr>
-        <w:pStyle w:val="ListParagraph"/>
-        <w:numPr>
-          <w:ilvl w:val="0"/>
-          <w:numId w:val="2"/>
-        </w:numPr>
-        <w:spacing w:before="40" w:after="40"/>
-      </w:pPr>
-      <w:r>
-        <w:rPr>
-          <w:sz w:val="20"/>
-          <w:szCs w:val="20"/>
-        </w:rPr>
-        <w:t>Built a dedicated authentication and authorization microservice using OAuth 2.0 and JWT, consumed by peer microservices within the same course project.</w:t>
-      </w:r>
-    </w:p>
-    <w:p>
-      <w:pPr>
-        <w:pStyle w:val="ListParagraph"/>
-        <w:numPr>
-          <w:ilvl w:val="0"/>
-          <w:numId w:val="2"/>
-        </w:numPr>
-        <w:spacing w:before="40" w:after="40"/>
-      </w:pPr>
-      <w:r>
-        <w:rPr>
-          <w:sz w:val="20"/>
-          <w:szCs w:val="20"/>
-        </w:rPr>
-        <w:t>Implemented Single Sign-On (SSO) to provide seamless authentication persistence across multiple microservices.</w:t>
-      </w:r>
-    </w:p>
-    <w:p>
-      <w:pPr>
-        <w:spacing w:before="160" w:after="40"/>
-      </w:pPr>
-      <w:r>
-        <w:rPr>
-          <w:b/>
-          <w:bCs/>
-          <w:sz w:val="22"/>
-          <w:szCs w:val="22"/>
-        </w:rPr>
-        <w:t xml:space="preserve">Silver </w:t>
-      </w:r>
-      <w:proofErr w:type="gramStart"/>
-      <w:r>
-        <w:rPr>
-          <w:b/>
-          <w:bCs/>
-          <w:sz w:val="22"/>
-          <w:szCs w:val="22"/>
-        </w:rPr>
-        <w:t>Screen</w:t>
-      </w:r>
-      <w:r>
-        <w:rPr>
-          <w:i/>
-          <w:iCs/>
-          <w:color w:val="444444"/>
-        </w:rPr>
-        <w:t xml:space="preserve">  |</w:t>
-      </w:r>
-      <w:proofErr w:type="gramEnd"/>
-      <w:r>
-        <w:rPr>
-          <w:i/>
-          <w:iCs/>
-          <w:color w:val="444444"/>
-        </w:rPr>
-        <w:t xml:space="preserve">  Hobby Project</w:t>
-      </w:r>
-    </w:p>
-    <w:p>
-      <w:pPr>
-        <w:pStyle w:val="ListParagraph"/>
-        <w:numPr>
-          <w:ilvl w:val="0"/>
-          <w:numId w:val="2"/>
-        </w:numPr>
-        <w:spacing w:before="40" w:after="40"/>
-      </w:pPr>
-      <w:r>
-        <w:rPr>
-          <w:sz w:val="20"/>
-          <w:szCs w:val="20"/>
-        </w:rPr>
-        <w:t>Developed a cinema ticketing and operations management system supporting both customer-facing and internal business workflows</w:t>
-      </w:r>
-      <w:r>
-        <w:rPr>
-          <w:sz w:val="20"/>
-          <w:szCs w:val="20"/>
-        </w:rPr>
-        <w:t xml:space="preserve"> with </w:t>
-      </w:r>
-      <w:proofErr w:type="gramStart"/>
-      <w:r>
-        <w:rPr>
-          <w:sz w:val="20"/>
-          <w:szCs w:val="20"/>
-        </w:rPr>
-        <w:t>role based</w:t>
-      </w:r>
-      <w:proofErr w:type="gramEnd"/>
-      <w:r>
-        <w:rPr>
-          <w:sz w:val="20"/>
-          <w:szCs w:val="20"/>
-        </w:rPr>
-        <w:t xml:space="preserve"> access</w:t>
-      </w:r>
-      <w:r>
-        <w:rPr>
-          <w:sz w:val="20"/>
-          <w:szCs w:val="20"/>
-        </w:rPr>
-        <w:t>.</w:t>
-      </w:r>
-    </w:p>
-    <w:p>
-      <w:pPr>
-        <w:pStyle w:val="ListParagraph"/>
-        <w:numPr>
-          <w:ilvl w:val="0"/>
-          <w:numId w:val="2"/>
-        </w:numPr>
-        <w:spacing w:before="40" w:after="40"/>
-      </w:pPr>
-      <w:r>
-        <w:rPr>
-          <w:sz w:val="20"/>
-          <w:szCs w:val="20"/>
-        </w:rPr>
-        <w:t>Implemented an online ticket booking platform with seat selection and order management capabilities for customers.</w:t>
-      </w:r>
-    </w:p>
-    <w:p>
-      <w:pPr>
-        <w:pStyle w:val="ListParagraph"/>
-        <w:numPr>
-          <w:ilvl w:val="0"/>
-          <w:numId w:val="2"/>
-        </w:numPr>
-        <w:spacing w:before="40" w:after="40"/>
-      </w:pPr>
-      <w:r>
-        <w:rPr>
-          <w:sz w:val="20"/>
-          <w:szCs w:val="20"/>
-        </w:rPr>
-        <w:t>Integrated a payment gateway interface for processing and validating online ticket purchases through a payment gateway stub.</w:t>
-      </w:r>
-    </w:p>
-    <w:p>
-      <w:pPr>
-        <w:pStyle w:val="ListParagraph"/>
-        <w:numPr>
-          <w:ilvl w:val="0"/>
-          <w:numId w:val="2"/>
-        </w:numPr>
-        <w:spacing w:before="40" w:after="40"/>
-      </w:pPr>
-      <w:r>
-        <w:rPr>
-          <w:sz w:val="20"/>
-          <w:szCs w:val="20"/>
-        </w:rPr>
-        <w:t>Designed a point-of-sale (POS) workflow for staff to manage and process onsite ticket transactions.</w:t>
-      </w:r>
-    </w:p>
-    <w:p>
-      <w:pPr>
-        <w:pStyle w:val="ListParagraph"/>
-        <w:numPr>
-          <w:ilvl w:val="0"/>
-          <w:numId w:val="2"/>
-        </w:numPr>
-        <w:spacing w:before="40" w:after="40"/>
-      </w:pPr>
-      <w:r>
-        <w:rPr>
-          <w:sz w:val="20"/>
-          <w:szCs w:val="20"/>
-        </w:rPr>
-        <w:t>Developed scheduling functionality for managing movie showtimes and screening availability.</w:t>
-      </w:r>
-    </w:p>
-    <w:p>
-      <w:pPr>
-        <w:pStyle w:val="ListParagraph"/>
-        <w:numPr>
-          <w:ilvl w:val="0"/>
-          <w:numId w:val="2"/>
-        </w:numPr>
-        <w:spacing w:before="40" w:after="40"/>
-      </w:pPr>
-      <w:r>
-        <w:rPr>
-          <w:sz w:val="20"/>
-          <w:szCs w:val="20"/>
-        </w:rPr>
-        <w:t>Built master data management features for maintaining studios, movies, and related operational data.</w:t>
+        <w:t>, Nginx, and PostgreSQL.</w:t>
       </w:r>
     </w:p>
     <w:sectPr>
@@ -1953,6 +2104,37 @@
       <w:szCs w:val="20"/>
     </w:rPr>
   </w:style>
+  <w:style w:type="paragraph" w:customStyle="1" w:styleId="isselectedend">
+    <w:name w:val="isselectedend"/>
+    <w:basedOn w:val="Normal"/>
+    <w:rsid w:val="00B033DB"/>
+    <w:pPr>
+      <w:spacing w:before="100" w:beforeAutospacing="1" w:after="100" w:afterAutospacing="1"/>
+    </w:pPr>
+    <w:rPr>
+      <w:rFonts w:ascii="Times New Roman" w:eastAsia="Times New Roman" w:hAnsi="Times New Roman" w:cs="Times New Roman"/>
+      <w:color w:val="auto"/>
+      <w:sz w:val="24"/>
+      <w:szCs w:val="24"/>
+    </w:rPr>
+  </w:style>
+  <w:style w:type="paragraph" w:styleId="NormalWeb">
+    <w:name w:val="Normal (Web)"/>
+    <w:basedOn w:val="Normal"/>
+    <w:uiPriority w:val="99"/>
+    <w:semiHidden/>
+    <w:unhideWhenUsed/>
+    <w:rsid w:val="00B033DB"/>
+    <w:pPr>
+      <w:spacing w:before="100" w:beforeAutospacing="1" w:after="100" w:afterAutospacing="1"/>
+    </w:pPr>
+    <w:rPr>
+      <w:rFonts w:ascii="Times New Roman" w:eastAsia="Times New Roman" w:hAnsi="Times New Roman" w:cs="Times New Roman"/>
+      <w:color w:val="auto"/>
+      <w:sz w:val="24"/>
+      <w:szCs w:val="24"/>
+    </w:rPr>
+  </w:style>
 </w:styles>
 </file>
 

</xml_diff>

<commit_message>
feat: move gear to experience section and enhance design
</commit_message>
<xml_diff>
--- a/Dava_Hannas_Putra_ATS_CV.docx
+++ b/Dava_Hannas_Putra_ATS_CV.docx
@@ -40,8 +40,67 @@
           <w:sz w:val="20"/>
           <w:szCs w:val="20"/>
         </w:rPr>
-        <w:t>Bogor, West Java 16118  |  +62 821 2402 4280  |  davahsp@gmail.com</w:t>
-      </w:r>
+        <w:t xml:space="preserve">Bogor, West Java </w:t>
+      </w:r>
+      <w:proofErr w:type="gramStart"/>
+      <w:r>
+        <w:rPr>
+          <w:sz w:val="20"/>
+          <w:szCs w:val="20"/>
+        </w:rPr>
+        <w:t>16118  |</w:t>
+      </w:r>
+      <w:proofErr w:type="gramEnd"/>
+      <w:r>
+        <w:rPr>
+          <w:sz w:val="20"/>
+          <w:szCs w:val="20"/>
+        </w:rPr>
+        <w:t xml:space="preserve">  +62 821 2402 </w:t>
+      </w:r>
+      <w:proofErr w:type="gramStart"/>
+      <w:r>
+        <w:rPr>
+          <w:sz w:val="20"/>
+          <w:szCs w:val="20"/>
+        </w:rPr>
+        <w:t>4280  |</w:t>
+      </w:r>
+      <w:proofErr w:type="gramEnd"/>
+      <w:r>
+        <w:rPr>
+          <w:sz w:val="20"/>
+          <w:szCs w:val="20"/>
+        </w:rPr>
+        <w:t xml:space="preserve">  </w:t>
+      </w:r>
+      <w:hyperlink r:id="rId5" w:history="1">
+        <w:r>
+          <w:rPr>
+            <w:rStyle w:val="Hyperlink"/>
+            <w:sz w:val="20"/>
+            <w:szCs w:val="20"/>
+          </w:rPr>
+          <w:t>davahsp@gmail.com</w:t>
+        </w:r>
+      </w:hyperlink>
+      <w:r>
+        <w:rPr>
+          <w:sz w:val="20"/>
+          <w:szCs w:val="20"/>
+        </w:rPr>
+        <w:t xml:space="preserve"> | </w:t>
+      </w:r>
+      <w:hyperlink r:id="rId6" w:history="1">
+        <w:r>
+          <w:rPr>
+            <w:rStyle w:val="Hyperlink"/>
+            <w:sz w:val="20"/>
+            <w:szCs w:val="20"/>
+          </w:rPr>
+          <w:t>https://davahs.pro</w:t>
+        </w:r>
+      </w:hyperlink>
     </w:p>
     <w:p>
       <w:pPr>
@@ -116,6 +175,9 @@
       <w:r>
         <w:t>Django, Spring Boot, Vue.js, React, HTMX</w:t>
       </w:r>
+      <w:r>
+        <w:t>, Laravel, Blade, Bootstrap</w:t>
+      </w:r>
     </w:p>
     <w:p>
       <w:pPr>
@@ -160,13 +222,7 @@
       </w:r>
       <w:proofErr w:type="spellEnd"/>
       <w:r>
-        <w:t>,</w:t>
-      </w:r>
-      <w:r>
-        <w:t xml:space="preserve"> AWS EC2, Docker, Kubernetes</w:t>
-      </w:r>
-      <w:r>
-        <w:t xml:space="preserve"> </w:t>
+        <w:t xml:space="preserve">, AWS EC2, Docker, Kubernetes </w:t>
       </w:r>
     </w:p>
     <w:p>
@@ -178,91 +234,25 @@
           <w:b/>
           <w:bCs/>
         </w:rPr>
-        <w:t xml:space="preserve">API &amp; </w:t>
-      </w:r>
+        <w:t xml:space="preserve">API &amp; Integrations: </w:t>
+      </w:r>
+      <w:r>
+        <w:t xml:space="preserve">Twilio API, Gemini API, Resend API </w:t>
+      </w:r>
+    </w:p>
+    <w:p>
+      <w:pPr>
+        <w:spacing w:before="60" w:after="60"/>
+      </w:pPr>
       <w:r>
         <w:rPr>
           <w:b/>
           <w:bCs/>
         </w:rPr>
-        <w:t>Integration</w:t>
-      </w:r>
-      <w:r>
-        <w:rPr>
-          <w:b/>
-          <w:bCs/>
-        </w:rPr>
-        <w:t>s</w:t>
-      </w:r>
-      <w:r>
-        <w:rPr>
-          <w:b/>
-          <w:bCs/>
-        </w:rPr>
-        <w:t xml:space="preserve">: </w:t>
-      </w:r>
-      <w:r>
-        <w:t>Twilio</w:t>
-      </w:r>
-      <w:r>
-        <w:t xml:space="preserve"> API</w:t>
-      </w:r>
-      <w:r>
-        <w:t>, Gemini API</w:t>
-      </w:r>
-      <w:r>
-        <w:t>, Resend</w:t>
-      </w:r>
-      <w:r>
-        <w:t xml:space="preserve"> API</w:t>
-      </w:r>
-      <w:r>
-        <w:t xml:space="preserve"> </w:t>
-      </w:r>
-    </w:p>
-    <w:p>
-      <w:pPr>
-        <w:spacing w:before="60" w:after="60"/>
-      </w:pPr>
-      <w:r>
-        <w:rPr>
-          <w:b/>
-          <w:bCs/>
-        </w:rPr>
         <w:t xml:space="preserve">Concepts: </w:t>
       </w:r>
       <w:r>
-        <w:t>System Design &amp; Analysis,</w:t>
-      </w:r>
-      <w:r>
-        <w:t xml:space="preserve"> Software</w:t>
-      </w:r>
-      <w:r>
-        <w:t xml:space="preserve"> Architecture, </w:t>
-      </w:r>
-      <w:r>
-        <w:t xml:space="preserve">REST API, </w:t>
-      </w:r>
-      <w:r>
-        <w:t>Authentication</w:t>
-      </w:r>
-      <w:r>
-        <w:t xml:space="preserve"> &amp; </w:t>
-      </w:r>
-      <w:r>
-        <w:t>Authorization,</w:t>
-      </w:r>
-      <w:r>
-        <w:t xml:space="preserve"> </w:t>
-      </w:r>
-      <w:r>
-        <w:t>OAuth 2.0, JWT</w:t>
-      </w:r>
-      <w:r>
-        <w:t>,</w:t>
-      </w:r>
-      <w:r>
-        <w:t xml:space="preserve"> Microservices</w:t>
+        <w:t>System Design &amp; Analysis, Software Architecture, REST API, Authentication &amp; Authorization, OAuth 2.0, JWT, Microservices</w:t>
       </w:r>
     </w:p>
     <w:p>
@@ -297,14 +287,32 @@
           <w:sz w:val="22"/>
           <w:szCs w:val="22"/>
         </w:rPr>
-        <w:t>Undergraduate Teaching Assistant</w:t>
-      </w:r>
-      <w:r>
-        <w:rPr>
-          <w:sz w:val="22"/>
-          <w:szCs w:val="22"/>
-        </w:rPr>
-        <w:t xml:space="preserve">  |  </w:t>
+        <w:t xml:space="preserve">Lead </w:t>
+      </w:r>
+      <w:proofErr w:type="gramStart"/>
+      <w:r>
+        <w:rPr>
+          <w:b/>
+          <w:bCs/>
+          <w:sz w:val="22"/>
+          <w:szCs w:val="22"/>
+        </w:rPr>
+        <w:t>Developer</w:t>
+      </w:r>
+      <w:r>
+        <w:rPr>
+          <w:sz w:val="22"/>
+          <w:szCs w:val="22"/>
+        </w:rPr>
+        <w:t xml:space="preserve">  |</w:t>
+      </w:r>
+      <w:proofErr w:type="gramEnd"/>
+      <w:r>
+        <w:rPr>
+          <w:sz w:val="22"/>
+          <w:szCs w:val="22"/>
+        </w:rPr>
+        <w:t xml:space="preserve">  </w:t>
       </w:r>
       <w:r>
         <w:rPr>
@@ -313,28 +321,32 @@
           <w:sz w:val="22"/>
           <w:szCs w:val="22"/>
         </w:rPr>
-        <w:t>University of Indonesia</w:t>
-      </w:r>
-      <w:r>
-        <w:rPr>
-          <w:sz w:val="22"/>
-          <w:szCs w:val="22"/>
-        </w:rPr>
-        <w:t xml:space="preserve">  |  Depok</w:t>
-      </w:r>
-      <w:r>
-        <w:rPr>
-          <w:sz w:val="22"/>
-          <w:szCs w:val="22"/>
-        </w:rPr>
-        <w:t xml:space="preserve"> </w:t>
-      </w:r>
-      <w:r>
-        <w:rPr>
-          <w:sz w:val="22"/>
-          <w:szCs w:val="22"/>
-        </w:rPr>
-        <w:t xml:space="preserve">              </w:t>
+        <w:t xml:space="preserve">GEAR – Garam Enterprise &amp; Analytics </w:t>
+      </w:r>
+      <w:proofErr w:type="gramStart"/>
+      <w:r>
+        <w:rPr>
+          <w:i/>
+          <w:iCs/>
+          <w:sz w:val="22"/>
+          <w:szCs w:val="22"/>
+        </w:rPr>
+        <w:t>Resource</w:t>
+      </w:r>
+      <w:r>
+        <w:rPr>
+          <w:sz w:val="22"/>
+          <w:szCs w:val="22"/>
+        </w:rPr>
+        <w:t xml:space="preserve">  |</w:t>
+      </w:r>
+      <w:proofErr w:type="gramEnd"/>
+      <w:r>
+        <w:rPr>
+          <w:sz w:val="22"/>
+          <w:szCs w:val="22"/>
+        </w:rPr>
+        <w:t xml:space="preserve">  University of Indonesia        </w:t>
       </w:r>
       <w:r>
         <w:rPr>
@@ -342,113 +354,201 @@
           <w:sz w:val="20"/>
           <w:szCs w:val="20"/>
         </w:rPr>
-        <w:t>August 2025 – Present</w:t>
-      </w:r>
-    </w:p>
-    <w:p>
-      <w:pPr>
-        <w:pStyle w:val="ListParagraph"/>
-        <w:numPr>
-          <w:ilvl w:val="0"/>
-          <w:numId w:val="2"/>
-        </w:numPr>
-        <w:spacing w:before="40" w:after="40"/>
-      </w:pPr>
-      <w:r>
-        <w:rPr>
-          <w:sz w:val="20"/>
-          <w:szCs w:val="20"/>
-        </w:rPr>
-        <w:t xml:space="preserve">Teach </w:t>
-      </w:r>
-      <w:r>
-        <w:rPr>
-          <w:sz w:val="20"/>
-          <w:szCs w:val="20"/>
-        </w:rPr>
-        <w:t>Statistics, Probability, Linear Algebra, and Calculus II to undergraduate students.</w:t>
-      </w:r>
-    </w:p>
-    <w:p>
-      <w:pPr>
-        <w:pStyle w:val="ListParagraph"/>
-        <w:numPr>
-          <w:ilvl w:val="0"/>
-          <w:numId w:val="2"/>
-        </w:numPr>
-        <w:spacing w:before="40" w:after="40"/>
-      </w:pPr>
-      <w:r>
-        <w:rPr>
-          <w:sz w:val="20"/>
-          <w:szCs w:val="20"/>
-        </w:rPr>
-        <w:t>Deliver lectures and le</w:t>
-      </w:r>
-      <w:r>
-        <w:rPr>
-          <w:sz w:val="20"/>
-          <w:szCs w:val="20"/>
-        </w:rPr>
-        <w:t>a</w:t>
-      </w:r>
-      <w:r>
-        <w:rPr>
-          <w:sz w:val="20"/>
-          <w:szCs w:val="20"/>
-        </w:rPr>
-        <w:t>d classroom sessions in the lecturer's absence.</w:t>
-      </w:r>
-    </w:p>
-    <w:p>
-      <w:pPr>
-        <w:pStyle w:val="ListParagraph"/>
-        <w:numPr>
-          <w:ilvl w:val="0"/>
-          <w:numId w:val="2"/>
-        </w:numPr>
-        <w:spacing w:before="40" w:after="40"/>
-      </w:pPr>
-      <w:r>
-        <w:rPr>
-          <w:sz w:val="20"/>
-          <w:szCs w:val="20"/>
-        </w:rPr>
-        <w:t>Conduct weekly tutorial and consultation sessions for students.</w:t>
-      </w:r>
-    </w:p>
-    <w:p>
-      <w:pPr>
-        <w:pStyle w:val="ListParagraph"/>
-        <w:numPr>
-          <w:ilvl w:val="0"/>
-          <w:numId w:val="2"/>
-        </w:numPr>
-        <w:spacing w:before="40" w:after="40"/>
-      </w:pPr>
-      <w:r>
-        <w:rPr>
-          <w:sz w:val="20"/>
-          <w:szCs w:val="20"/>
-        </w:rPr>
-        <w:t>Develop weekly quizzes, assignments, and examination problems.</w:t>
-      </w:r>
-    </w:p>
-    <w:p>
-      <w:pPr>
-        <w:pStyle w:val="ListParagraph"/>
-        <w:numPr>
-          <w:ilvl w:val="0"/>
-          <w:numId w:val="2"/>
-        </w:numPr>
-        <w:spacing w:before="40" w:after="40"/>
-      </w:pPr>
-      <w:r>
-        <w:rPr>
-          <w:sz w:val="20"/>
-          <w:szCs w:val="20"/>
-        </w:rPr>
-        <w:t>Grade and evaluate student assignments, quizzes, and examinations.</w:t>
+        <w:t>January 2026 – May 2026</w:t>
+      </w:r>
+    </w:p>
+    <w:p>
+      <w:pPr>
+        <w:pStyle w:val="ListParagraph"/>
+        <w:numPr>
+          <w:ilvl w:val="0"/>
+          <w:numId w:val="2"/>
+        </w:numPr>
+        <w:spacing w:before="40" w:after="40"/>
+      </w:pPr>
+      <w:r>
+        <w:rPr>
+          <w:sz w:val="20"/>
+          <w:szCs w:val="20"/>
+        </w:rPr>
+        <w:t>Led end-to-end development of a custom mini-ERP system from zero under University of Indonesia supervision, covering full-cycle requirements gathering, system analysis and design, backend development, and production deployment for a salt manufacturing and distribution company in Lampung, Indonesia.</w:t>
+      </w:r>
+    </w:p>
+    <w:p>
+      <w:pPr>
+        <w:pStyle w:val="ListParagraph"/>
+        <w:numPr>
+          <w:ilvl w:val="0"/>
+          <w:numId w:val="2"/>
+        </w:numPr>
+        <w:spacing w:before="40" w:after="40"/>
+      </w:pPr>
+      <w:r>
+        <w:rPr>
+          <w:sz w:val="20"/>
+          <w:szCs w:val="20"/>
+        </w:rPr>
+        <w:t>Managed and coordinated a team of 5 developers, overseeing task delegation, code review, and delivery timeline to ensure consistent progress across all development phases.</w:t>
+      </w:r>
+    </w:p>
+    <w:p>
+      <w:pPr>
+        <w:pStyle w:val="ListParagraph"/>
+        <w:numPr>
+          <w:ilvl w:val="0"/>
+          <w:numId w:val="2"/>
+        </w:numPr>
+        <w:spacing w:before="40" w:after="40"/>
+      </w:pPr>
+      <w:r>
+        <w:rPr>
+          <w:sz w:val="20"/>
+          <w:szCs w:val="20"/>
+        </w:rPr>
+        <w:t xml:space="preserve">Designed and developed </w:t>
+      </w:r>
+      <w:r>
+        <w:rPr>
+          <w:sz w:val="20"/>
+          <w:szCs w:val="20"/>
+        </w:rPr>
+        <w:t>6</w:t>
+      </w:r>
+      <w:r>
+        <w:rPr>
+          <w:sz w:val="20"/>
+          <w:szCs w:val="20"/>
+        </w:rPr>
+        <w:t xml:space="preserve"> core modules</w:t>
+      </w:r>
+      <w:r>
+        <w:rPr>
+          <w:sz w:val="20"/>
+          <w:szCs w:val="20"/>
+        </w:rPr>
+        <w:t xml:space="preserve">; </w:t>
+      </w:r>
+      <w:r>
+        <w:rPr>
+          <w:sz w:val="20"/>
+          <w:szCs w:val="20"/>
+        </w:rPr>
+        <w:t xml:space="preserve">procurement, inventory, sales, finance, </w:t>
+      </w:r>
+      <w:r>
+        <w:rPr>
+          <w:sz w:val="20"/>
+          <w:szCs w:val="20"/>
+        </w:rPr>
+        <w:t xml:space="preserve">pricing, </w:t>
+      </w:r>
+      <w:r>
+        <w:rPr>
+          <w:sz w:val="20"/>
+          <w:szCs w:val="20"/>
+        </w:rPr>
+        <w:t>and analytics</w:t>
+      </w:r>
+      <w:r>
+        <w:rPr>
+          <w:sz w:val="20"/>
+          <w:szCs w:val="20"/>
+        </w:rPr>
+        <w:t xml:space="preserve">, </w:t>
+      </w:r>
+      <w:r>
+        <w:rPr>
+          <w:sz w:val="20"/>
+          <w:szCs w:val="20"/>
+        </w:rPr>
+        <w:t>digitizing paper-based workflows, reducing manual errors, and providing automated audit trails for over 30 employees.</w:t>
+      </w:r>
+    </w:p>
+    <w:p>
+      <w:pPr>
+        <w:pStyle w:val="ListParagraph"/>
+        <w:numPr>
+          <w:ilvl w:val="0"/>
+          <w:numId w:val="2"/>
+        </w:numPr>
+        <w:spacing w:before="40" w:after="40"/>
+      </w:pPr>
+      <w:r>
+        <w:rPr>
+          <w:sz w:val="20"/>
+          <w:szCs w:val="20"/>
+        </w:rPr>
+        <w:t>Built a permission-based WhatsApp chatbot integrated with Twilio webhooks and Gemini LLM API, providing an intuitive interface for employees with limited technical literacy.</w:t>
+      </w:r>
+    </w:p>
+    <w:p>
+      <w:pPr>
+        <w:pStyle w:val="ListParagraph"/>
+        <w:numPr>
+          <w:ilvl w:val="0"/>
+          <w:numId w:val="2"/>
+        </w:numPr>
+        <w:spacing w:before="40" w:after="40"/>
+      </w:pPr>
+      <w:r>
+        <w:t xml:space="preserve">Implemented a secure account recovery workflow by integrating Django </w:t>
+      </w:r>
+      <w:proofErr w:type="spellStart"/>
+      <w:r>
+        <w:t>Anymail</w:t>
+      </w:r>
+      <w:proofErr w:type="spellEnd"/>
+      <w:r>
+        <w:t xml:space="preserve"> with the Resend API, enabling password reset and email-based account recovery for system users.</w:t>
+      </w:r>
+    </w:p>
+    <w:p>
+      <w:pPr>
+        <w:pStyle w:val="ListParagraph"/>
+        <w:numPr>
+          <w:ilvl w:val="0"/>
+          <w:numId w:val="2"/>
+        </w:numPr>
+        <w:spacing w:before="40" w:after="40"/>
+      </w:pPr>
+      <w:r>
+        <w:rPr>
+          <w:sz w:val="20"/>
+          <w:szCs w:val="20"/>
+        </w:rPr>
+        <w:t xml:space="preserve">Deployed and maintained the production system on a Linux-based </w:t>
+      </w:r>
+      <w:proofErr w:type="spellStart"/>
+      <w:r>
+        <w:rPr>
+          <w:sz w:val="20"/>
+          <w:szCs w:val="20"/>
+        </w:rPr>
+        <w:t>DigitalOcean</w:t>
+      </w:r>
+      <w:proofErr w:type="spellEnd"/>
+      <w:r>
+        <w:rPr>
+          <w:sz w:val="20"/>
+          <w:szCs w:val="20"/>
+        </w:rPr>
+        <w:t xml:space="preserve"> VPS using Django, </w:t>
+      </w:r>
+      <w:proofErr w:type="spellStart"/>
+      <w:r>
+        <w:rPr>
+          <w:sz w:val="20"/>
+          <w:szCs w:val="20"/>
+        </w:rPr>
+        <w:t>Gunicorn</w:t>
+      </w:r>
+      <w:proofErr w:type="spellEnd"/>
+      <w:r>
+        <w:rPr>
+          <w:sz w:val="20"/>
+          <w:szCs w:val="20"/>
+        </w:rPr>
+        <w:t>, Nginx, and PostgreSQL, with full DevOps responsibility from initial setup to go-live.</w:t>
       </w:r>
     </w:p>
     <w:p>
@@ -465,8 +565,9 @@
           <w:sz w:val="22"/>
           <w:szCs w:val="22"/>
         </w:rPr>
-        <w:t>Private Tutor</w:t>
-      </w:r>
+        <w:t xml:space="preserve">Undergraduate Teaching </w:t>
+      </w:r>
+      <w:proofErr w:type="gramStart"/>
       <w:r>
         <w:rPr>
           <w:b/>
@@ -474,42 +575,56 @@
           <w:sz w:val="22"/>
           <w:szCs w:val="22"/>
         </w:rPr>
-        <w:t xml:space="preserve"> (Part Time)</w:t>
-      </w:r>
-      <w:r>
-        <w:rPr>
-          <w:sz w:val="22"/>
-          <w:szCs w:val="22"/>
-        </w:rPr>
-        <w:t xml:space="preserve">                                        </w:t>
-      </w:r>
-      <w:r>
-        <w:rPr>
-          <w:sz w:val="22"/>
-          <w:szCs w:val="22"/>
-        </w:rPr>
-        <w:t xml:space="preserve"> </w:t>
-      </w:r>
-      <w:r>
-        <w:rPr>
-          <w:sz w:val="22"/>
-          <w:szCs w:val="22"/>
-        </w:rPr>
-        <w:t xml:space="preserve"> </w:t>
-      </w:r>
-      <w:r>
-        <w:rPr>
-          <w:sz w:val="22"/>
-          <w:szCs w:val="22"/>
-        </w:rPr>
-        <w:t xml:space="preserve"> </w:t>
-      </w:r>
-      <w:r>
-        <w:rPr>
-          <w:sz w:val="22"/>
-          <w:szCs w:val="22"/>
-        </w:rPr>
-        <w:t xml:space="preserve">                                         </w:t>
+        <w:t>Assistant</w:t>
+      </w:r>
+      <w:r>
+        <w:rPr>
+          <w:sz w:val="22"/>
+          <w:szCs w:val="22"/>
+        </w:rPr>
+        <w:t xml:space="preserve">  |</w:t>
+      </w:r>
+      <w:proofErr w:type="gramEnd"/>
+      <w:r>
+        <w:rPr>
+          <w:sz w:val="22"/>
+          <w:szCs w:val="22"/>
+        </w:rPr>
+        <w:t xml:space="preserve">  </w:t>
+      </w:r>
+      <w:r>
+        <w:rPr>
+          <w:i/>
+          <w:iCs/>
+          <w:sz w:val="22"/>
+          <w:szCs w:val="22"/>
+        </w:rPr>
+        <w:t xml:space="preserve">University of </w:t>
+      </w:r>
+      <w:proofErr w:type="gramStart"/>
+      <w:r>
+        <w:rPr>
+          <w:i/>
+          <w:iCs/>
+          <w:sz w:val="22"/>
+          <w:szCs w:val="22"/>
+        </w:rPr>
+        <w:t>Indonesia</w:t>
+      </w:r>
+      <w:r>
+        <w:rPr>
+          <w:sz w:val="22"/>
+          <w:szCs w:val="22"/>
+        </w:rPr>
+        <w:t xml:space="preserve">  |</w:t>
+      </w:r>
+      <w:proofErr w:type="gramEnd"/>
+      <w:r>
+        <w:rPr>
+          <w:sz w:val="22"/>
+          <w:szCs w:val="22"/>
+        </w:rPr>
+        <w:t xml:space="preserve">  Depok               </w:t>
       </w:r>
       <w:r>
         <w:rPr>
@@ -517,80 +632,92 @@
           <w:sz w:val="20"/>
           <w:szCs w:val="20"/>
         </w:rPr>
-        <w:t>November 2023 – Present</w:t>
-      </w:r>
-    </w:p>
-    <w:p>
-      <w:pPr>
-        <w:pStyle w:val="ListParagraph"/>
-        <w:numPr>
-          <w:ilvl w:val="0"/>
-          <w:numId w:val="2"/>
-        </w:numPr>
-        <w:spacing w:before="40" w:after="40"/>
-        <w:rPr>
-          <w:sz w:val="20"/>
-          <w:szCs w:val="20"/>
-        </w:rPr>
-      </w:pPr>
-      <w:r>
-        <w:rPr>
-          <w:sz w:val="20"/>
-          <w:szCs w:val="20"/>
-        </w:rPr>
-        <w:t>Serve as a long-term paid private tutor for two students for over two years.</w:t>
-      </w:r>
-    </w:p>
-    <w:p>
-      <w:pPr>
-        <w:pStyle w:val="ListParagraph"/>
-        <w:numPr>
-          <w:ilvl w:val="0"/>
-          <w:numId w:val="2"/>
-        </w:numPr>
-        <w:spacing w:before="40" w:after="40"/>
-        <w:rPr>
-          <w:sz w:val="20"/>
-          <w:szCs w:val="20"/>
-        </w:rPr>
-      </w:pPr>
-      <w:r>
-        <w:rPr>
-          <w:sz w:val="20"/>
-          <w:szCs w:val="20"/>
-        </w:rPr>
-        <w:t xml:space="preserve">Teach </w:t>
-      </w:r>
-      <w:r>
-        <w:rPr>
-          <w:sz w:val="20"/>
-          <w:szCs w:val="20"/>
-        </w:rPr>
-        <w:t>university-level courses including Foundations of Programming, Object-Oriented Programming, Database Systems, Computer Architecture, Operating Systems, Accounting, and Enterprise Systems Fundamentals.</w:t>
-      </w:r>
-    </w:p>
-    <w:p>
-      <w:pPr>
-        <w:pStyle w:val="ListParagraph"/>
-        <w:numPr>
-          <w:ilvl w:val="0"/>
-          <w:numId w:val="2"/>
-        </w:numPr>
-        <w:spacing w:before="40" w:after="40"/>
-      </w:pPr>
-      <w:r>
-        <w:rPr>
-          <w:sz w:val="20"/>
-          <w:szCs w:val="20"/>
-        </w:rPr>
-        <w:t xml:space="preserve">Provide </w:t>
-      </w:r>
-      <w:r>
-        <w:rPr>
-          <w:sz w:val="20"/>
-          <w:szCs w:val="20"/>
-        </w:rPr>
-        <w:t>one-on-one academic mentoring, problem-solving guidance, and exam preparation support.</w:t>
+        <w:t>August 2025 – Present</w:t>
+      </w:r>
+    </w:p>
+    <w:p>
+      <w:pPr>
+        <w:pStyle w:val="ListParagraph"/>
+        <w:numPr>
+          <w:ilvl w:val="0"/>
+          <w:numId w:val="2"/>
+        </w:numPr>
+        <w:spacing w:before="40" w:after="40"/>
+      </w:pPr>
+      <w:r>
+        <w:rPr>
+          <w:sz w:val="20"/>
+          <w:szCs w:val="20"/>
+        </w:rPr>
+        <w:t>Teach Statistics, Probability, Linear Algebra, and Calculus II to undergraduate students.</w:t>
+      </w:r>
+    </w:p>
+    <w:p>
+      <w:pPr>
+        <w:pStyle w:val="ListParagraph"/>
+        <w:numPr>
+          <w:ilvl w:val="0"/>
+          <w:numId w:val="2"/>
+        </w:numPr>
+        <w:spacing w:before="40" w:after="40"/>
+      </w:pPr>
+      <w:r>
+        <w:rPr>
+          <w:sz w:val="20"/>
+          <w:szCs w:val="20"/>
+        </w:rPr>
+        <w:t>Deliver lectures and lead classroom sessions in the lecturer's absence.</w:t>
+      </w:r>
+    </w:p>
+    <w:p>
+      <w:pPr>
+        <w:pStyle w:val="ListParagraph"/>
+        <w:numPr>
+          <w:ilvl w:val="0"/>
+          <w:numId w:val="2"/>
+        </w:numPr>
+        <w:spacing w:before="40" w:after="40"/>
+      </w:pPr>
+      <w:r>
+        <w:rPr>
+          <w:sz w:val="20"/>
+          <w:szCs w:val="20"/>
+        </w:rPr>
+        <w:t>Conduct weekly tutorial and consultation sessions for students.</w:t>
+      </w:r>
+    </w:p>
+    <w:p>
+      <w:pPr>
+        <w:pStyle w:val="ListParagraph"/>
+        <w:numPr>
+          <w:ilvl w:val="0"/>
+          <w:numId w:val="2"/>
+        </w:numPr>
+        <w:spacing w:before="40" w:after="40"/>
+      </w:pPr>
+      <w:r>
+        <w:rPr>
+          <w:sz w:val="20"/>
+          <w:szCs w:val="20"/>
+        </w:rPr>
+        <w:t>Develop weekly quizzes, assignments, and examination problems.</w:t>
+      </w:r>
+    </w:p>
+    <w:p>
+      <w:pPr>
+        <w:pStyle w:val="ListParagraph"/>
+        <w:numPr>
+          <w:ilvl w:val="0"/>
+          <w:numId w:val="2"/>
+        </w:numPr>
+        <w:spacing w:before="40" w:after="40"/>
+      </w:pPr>
+      <w:r>
+        <w:rPr>
+          <w:sz w:val="20"/>
+          <w:szCs w:val="20"/>
+        </w:rPr>
+        <w:t>Grade and evaluate student assignments, quizzes, and examinations.</w:t>
       </w:r>
     </w:p>
     <w:p>
@@ -607,15 +734,9 @@
           <w:sz w:val="22"/>
           <w:szCs w:val="22"/>
         </w:rPr>
-        <w:t>Frontend Developer</w:t>
-      </w:r>
-      <w:r>
-        <w:rPr>
-          <w:sz w:val="22"/>
-          <w:szCs w:val="22"/>
-        </w:rPr>
-        <w:t xml:space="preserve"> </w:t>
-      </w:r>
+        <w:t xml:space="preserve">Private Tutor (Part </w:t>
+      </w:r>
+      <w:proofErr w:type="gramStart"/>
       <w:r>
         <w:rPr>
           <w:b/>
@@ -623,7 +744,133 @@
           <w:sz w:val="22"/>
           <w:szCs w:val="22"/>
         </w:rPr>
-        <w:t xml:space="preserve">(Volunteer) </w:t>
+        <w:t>Time)</w:t>
+      </w:r>
+      <w:r>
+        <w:rPr>
+          <w:sz w:val="22"/>
+          <w:szCs w:val="22"/>
+        </w:rPr>
+        <w:t xml:space="preserve">   </w:t>
+      </w:r>
+      <w:proofErr w:type="gramEnd"/>
+      <w:r>
+        <w:rPr>
+          <w:sz w:val="22"/>
+          <w:szCs w:val="22"/>
+        </w:rPr>
+        <w:t xml:space="preserve">                                                                                 </w:t>
+      </w:r>
+      <w:r>
+        <w:rPr>
+          <w:color w:val="555555"/>
+          <w:sz w:val="20"/>
+          <w:szCs w:val="20"/>
+        </w:rPr>
+        <w:t>November 2023 – Present</w:t>
+      </w:r>
+    </w:p>
+    <w:p>
+      <w:pPr>
+        <w:pStyle w:val="ListParagraph"/>
+        <w:numPr>
+          <w:ilvl w:val="0"/>
+          <w:numId w:val="2"/>
+        </w:numPr>
+        <w:spacing w:before="40" w:after="40"/>
+        <w:rPr>
+          <w:sz w:val="20"/>
+          <w:szCs w:val="20"/>
+        </w:rPr>
+      </w:pPr>
+      <w:r>
+        <w:rPr>
+          <w:sz w:val="20"/>
+          <w:szCs w:val="20"/>
+        </w:rPr>
+        <w:t>Serve as a long-term paid private tutor for two students for over two years.</w:t>
+      </w:r>
+    </w:p>
+    <w:p>
+      <w:pPr>
+        <w:pStyle w:val="ListParagraph"/>
+        <w:numPr>
+          <w:ilvl w:val="0"/>
+          <w:numId w:val="2"/>
+        </w:numPr>
+        <w:spacing w:before="40" w:after="40"/>
+        <w:rPr>
+          <w:sz w:val="20"/>
+          <w:szCs w:val="20"/>
+        </w:rPr>
+      </w:pPr>
+      <w:r>
+        <w:rPr>
+          <w:sz w:val="20"/>
+          <w:szCs w:val="20"/>
+        </w:rPr>
+        <w:t>Teach university-level courses including Foundations of Programming, Object-Oriented Programming, Database Systems, Computer Architecture, Operating Systems, Accounting, and Enterprise Systems Fundamentals.</w:t>
+      </w:r>
+    </w:p>
+    <w:p>
+      <w:pPr>
+        <w:pStyle w:val="ListParagraph"/>
+        <w:numPr>
+          <w:ilvl w:val="0"/>
+          <w:numId w:val="2"/>
+        </w:numPr>
+        <w:spacing w:before="40" w:after="40"/>
+      </w:pPr>
+      <w:r>
+        <w:rPr>
+          <w:sz w:val="20"/>
+          <w:szCs w:val="20"/>
+        </w:rPr>
+        <w:t>Provide one-on-one academic mentoring, problem-solving guidance, and exam preparation support.</w:t>
+      </w:r>
+    </w:p>
+    <w:p>
+      <w:pPr>
+        <w:tabs>
+          <w:tab w:val="right" w:pos="9360"/>
+        </w:tabs>
+        <w:spacing w:before="160" w:after="40"/>
+      </w:pPr>
+      <w:r>
+        <w:rPr>
+          <w:b/>
+          <w:bCs/>
+          <w:sz w:val="22"/>
+          <w:szCs w:val="22"/>
+        </w:rPr>
+        <w:lastRenderedPageBreak/>
+        <w:t>Frontend Developer</w:t>
+      </w:r>
+      <w:r>
+        <w:rPr>
+          <w:sz w:val="22"/>
+          <w:szCs w:val="22"/>
+        </w:rPr>
+        <w:t xml:space="preserve"> </w:t>
+      </w:r>
+      <w:r>
+        <w:rPr>
+          <w:b/>
+          <w:bCs/>
+          <w:sz w:val="22"/>
+          <w:szCs w:val="22"/>
+        </w:rPr>
+        <w:t>(</w:t>
+      </w:r>
+      <w:proofErr w:type="gramStart"/>
+      <w:r>
+        <w:rPr>
+          <w:b/>
+          <w:bCs/>
+          <w:sz w:val="22"/>
+          <w:szCs w:val="22"/>
+        </w:rPr>
+        <w:t xml:space="preserve">Volunteer) </w:t>
       </w:r>
       <w:r>
         <w:rPr>
@@ -632,6 +879,7 @@
         </w:rPr>
         <w:t xml:space="preserve"> |</w:t>
       </w:r>
+      <w:proofErr w:type="gramEnd"/>
       <w:r>
         <w:rPr>
           <w:sz w:val="22"/>
@@ -646,21 +894,32 @@
           <w:sz w:val="22"/>
           <w:szCs w:val="22"/>
         </w:rPr>
-        <w:t xml:space="preserve">GSJA Betlehem  </w:t>
-      </w:r>
-      <w:r>
-        <w:rPr>
-          <w:sz w:val="22"/>
-          <w:szCs w:val="22"/>
-        </w:rPr>
-        <w:t>|  Bogor</w:t>
-      </w:r>
-      <w:r>
-        <w:rPr>
-          <w:sz w:val="22"/>
-          <w:szCs w:val="22"/>
-        </w:rPr>
-        <w:t xml:space="preserve">                          </w:t>
+        <w:t xml:space="preserve">GSJA </w:t>
+      </w:r>
+      <w:proofErr w:type="gramStart"/>
+      <w:r>
+        <w:rPr>
+          <w:i/>
+          <w:iCs/>
+          <w:sz w:val="22"/>
+          <w:szCs w:val="22"/>
+        </w:rPr>
+        <w:t xml:space="preserve">Betlehem  </w:t>
+      </w:r>
+      <w:r>
+        <w:rPr>
+          <w:sz w:val="22"/>
+          <w:szCs w:val="22"/>
+        </w:rPr>
+        <w:t>|</w:t>
+      </w:r>
+      <w:proofErr w:type="gramEnd"/>
+      <w:r>
+        <w:rPr>
+          <w:sz w:val="22"/>
+          <w:szCs w:val="22"/>
+        </w:rPr>
+        <w:t xml:space="preserve">  Bogor                          </w:t>
       </w:r>
       <w:r>
         <w:rPr>
@@ -668,31 +927,7 @@
           <w:sz w:val="20"/>
           <w:szCs w:val="20"/>
         </w:rPr>
-        <w:t>September</w:t>
-      </w:r>
-      <w:r>
-        <w:rPr>
-          <w:color w:val="555555"/>
-          <w:sz w:val="20"/>
-          <w:szCs w:val="20"/>
-        </w:rPr>
-        <w:t xml:space="preserve"> 202</w:t>
-      </w:r>
-      <w:r>
-        <w:rPr>
-          <w:color w:val="555555"/>
-          <w:sz w:val="20"/>
-          <w:szCs w:val="20"/>
-        </w:rPr>
-        <w:t>4</w:t>
-      </w:r>
-      <w:r>
-        <w:rPr>
-          <w:color w:val="555555"/>
-          <w:sz w:val="20"/>
-          <w:szCs w:val="20"/>
-        </w:rPr>
-        <w:t xml:space="preserve"> – Present</w:t>
+        <w:t>September 2024 – Present</w:t>
       </w:r>
     </w:p>
     <w:p>
@@ -817,6 +1052,8 @@
       <w:pPr>
         <w:spacing w:before="160" w:after="40"/>
       </w:pPr>
+      <w:proofErr w:type="spellStart"/>
+      <w:proofErr w:type="gramStart"/>
       <w:r>
         <w:rPr>
           <w:b/>
@@ -824,204 +1061,25 @@
           <w:sz w:val="22"/>
           <w:szCs w:val="22"/>
         </w:rPr>
-        <w:t>Garam Enterprise &amp; Analytics Resource (GEAR)</w:t>
-      </w:r>
+        <w:t>TravelAPAP</w:t>
+      </w:r>
+      <w:proofErr w:type="spellEnd"/>
       <w:r>
         <w:rPr>
           <w:i/>
           <w:iCs/>
           <w:color w:val="444444"/>
         </w:rPr>
-        <w:t xml:space="preserve">  |  Lead Developer</w:t>
-      </w:r>
-    </w:p>
-    <w:p>
-      <w:pPr>
-        <w:pStyle w:val="ListParagraph"/>
-        <w:numPr>
-          <w:ilvl w:val="0"/>
-          <w:numId w:val="2"/>
-        </w:numPr>
-        <w:spacing w:before="40" w:after="40"/>
-      </w:pPr>
-      <w:r>
-        <w:rPr>
-          <w:sz w:val="20"/>
-          <w:szCs w:val="20"/>
-        </w:rPr>
-        <w:t xml:space="preserve">Led a small development team under University of Indonesia supervision to build a custom ERP system </w:t>
-      </w:r>
-      <w:r>
-        <w:rPr>
-          <w:sz w:val="20"/>
-          <w:szCs w:val="20"/>
-        </w:rPr>
-        <w:t xml:space="preserve">with a permission-based access </w:t>
-      </w:r>
-      <w:r>
-        <w:rPr>
-          <w:sz w:val="20"/>
-          <w:szCs w:val="20"/>
-        </w:rPr>
-        <w:t>for a manufacturing and salt distribution company in Lampung, Indonesia</w:t>
-      </w:r>
-      <w:r>
-        <w:rPr>
-          <w:sz w:val="20"/>
-          <w:szCs w:val="20"/>
-        </w:rPr>
-        <w:t xml:space="preserve">, used by </w:t>
-      </w:r>
-      <w:r>
-        <w:rPr>
-          <w:sz w:val="20"/>
-          <w:szCs w:val="20"/>
-        </w:rPr>
-        <w:t xml:space="preserve">over </w:t>
-      </w:r>
-      <w:r>
-        <w:rPr>
-          <w:sz w:val="20"/>
-          <w:szCs w:val="20"/>
-        </w:rPr>
-        <w:t>30 employees.</w:t>
-      </w:r>
-    </w:p>
-    <w:p>
-      <w:pPr>
-        <w:pStyle w:val="ListParagraph"/>
-        <w:numPr>
-          <w:ilvl w:val="0"/>
-          <w:numId w:val="2"/>
-        </w:numPr>
-        <w:spacing w:before="40" w:after="40"/>
-      </w:pPr>
-      <w:r>
-        <w:rPr>
-          <w:sz w:val="20"/>
-          <w:szCs w:val="20"/>
-        </w:rPr>
-        <w:lastRenderedPageBreak/>
-        <w:t>Designed and developed procurement, inventory, sales, finance, and analytics modules that digitized paper-based workflows, reduced manual errors, provided automated audit trails, and significantly accelerated business processes.</w:t>
-      </w:r>
-    </w:p>
-    <w:p>
-      <w:pPr>
-        <w:pStyle w:val="ListParagraph"/>
-        <w:numPr>
-          <w:ilvl w:val="0"/>
-          <w:numId w:val="2"/>
-        </w:numPr>
-        <w:spacing w:before="40" w:after="40"/>
-      </w:pPr>
-      <w:r>
-        <w:rPr>
-          <w:sz w:val="20"/>
-          <w:szCs w:val="20"/>
-        </w:rPr>
-        <w:t>Implemented account recovery</w:t>
-      </w:r>
-      <w:r>
-        <w:rPr>
-          <w:sz w:val="20"/>
-          <w:szCs w:val="20"/>
-        </w:rPr>
-        <w:t xml:space="preserve"> (forget password)</w:t>
-      </w:r>
-      <w:r>
-        <w:rPr>
-          <w:sz w:val="20"/>
-          <w:szCs w:val="20"/>
-        </w:rPr>
-        <w:t xml:space="preserve"> workflow using Resend email service</w:t>
-      </w:r>
-      <w:r>
-        <w:rPr>
-          <w:sz w:val="20"/>
-          <w:szCs w:val="20"/>
-        </w:rPr>
-        <w:t>.</w:t>
-      </w:r>
-    </w:p>
-    <w:p>
-      <w:pPr>
-        <w:pStyle w:val="ListParagraph"/>
-        <w:numPr>
-          <w:ilvl w:val="0"/>
-          <w:numId w:val="2"/>
-        </w:numPr>
-        <w:spacing w:before="40" w:after="40"/>
-      </w:pPr>
-      <w:r>
-        <w:t xml:space="preserve">Implemented a </w:t>
-      </w:r>
-      <w:r>
-        <w:t>permission</w:t>
-      </w:r>
-      <w:r>
-        <w:t>-based WhatsApp chatbot</w:t>
-      </w:r>
-      <w:r>
-        <w:t xml:space="preserve"> using Twilio and webhook</w:t>
-      </w:r>
-      <w:r>
-        <w:t xml:space="preserve"> that provided an intuitive interface for employees with limited technical literacy</w:t>
-      </w:r>
-      <w:r>
-        <w:t>, integrated with Gemini LLM API.</w:t>
-      </w:r>
-    </w:p>
-    <w:p>
-      <w:pPr>
-        <w:pStyle w:val="ListParagraph"/>
-        <w:numPr>
-          <w:ilvl w:val="0"/>
-          <w:numId w:val="2"/>
-        </w:numPr>
-        <w:spacing w:before="40" w:after="40"/>
-      </w:pPr>
-      <w:r>
-        <w:t xml:space="preserve">Deployed and maintained the production system on a Linux-based </w:t>
-      </w:r>
-      <w:proofErr w:type="spellStart"/>
-      <w:r>
-        <w:t>DigitalOcean</w:t>
-      </w:r>
-      <w:proofErr w:type="spellEnd"/>
-      <w:r>
-        <w:t xml:space="preserve"> server using </w:t>
-      </w:r>
-      <w:proofErr w:type="spellStart"/>
-      <w:r>
-        <w:t>Gunicorn</w:t>
-      </w:r>
-      <w:proofErr w:type="spellEnd"/>
-      <w:r>
-        <w:t>, Nginx, and PostgreSQL.</w:t>
-      </w:r>
-    </w:p>
-    <w:p>
-      <w:pPr>
-        <w:spacing w:before="160" w:after="40"/>
-      </w:pPr>
-      <w:proofErr w:type="spellStart"/>
-      <w:r>
-        <w:rPr>
-          <w:b/>
-          <w:bCs/>
-          <w:sz w:val="22"/>
-          <w:szCs w:val="22"/>
-        </w:rPr>
-        <w:t>TravelAPAP</w:t>
-      </w:r>
-      <w:proofErr w:type="spellEnd"/>
+        <w:t xml:space="preserve">  |</w:t>
+      </w:r>
+      <w:proofErr w:type="gramEnd"/>
       <w:r>
         <w:rPr>
           <w:i/>
           <w:iCs/>
           <w:color w:val="444444"/>
         </w:rPr>
-        <w:t xml:space="preserve">  |  Campus Course Project</w:t>
+        <w:t xml:space="preserve">  Campus Course Project</w:t>
       </w:r>
     </w:p>
     <w:p>
@@ -1106,56 +1164,7 @@
           <w:sz w:val="20"/>
           <w:szCs w:val="20"/>
         </w:rPr>
-        <w:t xml:space="preserve">Deployed the microservices using </w:t>
-      </w:r>
-      <w:r>
-        <w:rPr>
-          <w:sz w:val="20"/>
-          <w:szCs w:val="20"/>
-        </w:rPr>
-        <w:t xml:space="preserve">AWS </w:t>
-      </w:r>
-      <w:r>
-        <w:rPr>
-          <w:sz w:val="20"/>
-          <w:szCs w:val="20"/>
-        </w:rPr>
-        <w:t xml:space="preserve">EC2, </w:t>
-      </w:r>
-      <w:r>
-        <w:rPr>
-          <w:sz w:val="20"/>
-          <w:szCs w:val="20"/>
-        </w:rPr>
-        <w:t>Docker</w:t>
-      </w:r>
-      <w:r>
-        <w:rPr>
-          <w:sz w:val="20"/>
-          <w:szCs w:val="20"/>
-        </w:rPr>
-        <w:t>,</w:t>
-      </w:r>
-      <w:r>
-        <w:rPr>
-          <w:sz w:val="20"/>
-          <w:szCs w:val="20"/>
-        </w:rPr>
-        <w:t xml:space="preserve"> </w:t>
-      </w:r>
-      <w:r>
-        <w:rPr>
-          <w:sz w:val="20"/>
-          <w:szCs w:val="20"/>
-        </w:rPr>
-        <w:t>and Kubernetes</w:t>
-      </w:r>
-      <w:r>
-        <w:rPr>
-          <w:sz w:val="20"/>
-          <w:szCs w:val="20"/>
-        </w:rPr>
-        <w:t>.</w:t>
+        <w:t>Deployed the microservices using AWS EC2, Docker, and Kubernetes.</w:t>
       </w:r>
     </w:p>
     <w:p>
@@ -1169,7 +1178,17 @@
           <w:sz w:val="22"/>
           <w:szCs w:val="22"/>
         </w:rPr>
-        <w:t>Silver Screen</w:t>
+        <w:t xml:space="preserve">Silver </w:t>
+      </w:r>
+      <w:proofErr w:type="gramStart"/>
+      <w:r>
+        <w:rPr>
+          <w:b/>
+          <w:bCs/>
+          <w:sz w:val="22"/>
+          <w:szCs w:val="22"/>
+        </w:rPr>
+        <w:t>Screen</w:t>
       </w:r>
       <w:r>
         <w:rPr>
@@ -1177,52 +1196,33 @@
           <w:iCs/>
           <w:color w:val="444444"/>
         </w:rPr>
-        <w:t xml:space="preserve">  |  Hobby Project</w:t>
-      </w:r>
-    </w:p>
-    <w:p>
-      <w:pPr>
-        <w:pStyle w:val="ListParagraph"/>
-        <w:numPr>
-          <w:ilvl w:val="0"/>
-          <w:numId w:val="2"/>
-        </w:numPr>
-        <w:spacing w:before="40" w:after="40"/>
-      </w:pPr>
-      <w:r>
-        <w:rPr>
-          <w:sz w:val="20"/>
-          <w:szCs w:val="20"/>
-        </w:rPr>
-        <w:t>Developed a cinema ticketing and operations management system supporting both customer-facing and internal business workflows</w:t>
-      </w:r>
-      <w:r>
-        <w:rPr>
-          <w:sz w:val="20"/>
-          <w:szCs w:val="20"/>
-        </w:rPr>
-        <w:t xml:space="preserve"> with role</w:t>
-      </w:r>
-      <w:r>
-        <w:rPr>
-          <w:sz w:val="20"/>
-          <w:szCs w:val="20"/>
-        </w:rPr>
-        <w:t>-</w:t>
-      </w:r>
-      <w:r>
-        <w:rPr>
-          <w:sz w:val="20"/>
-          <w:szCs w:val="20"/>
-        </w:rPr>
-        <w:t>based access</w:t>
-      </w:r>
-      <w:r>
-        <w:rPr>
-          <w:sz w:val="20"/>
-          <w:szCs w:val="20"/>
-        </w:rPr>
-        <w:t>.</w:t>
+        <w:t xml:space="preserve">  |</w:t>
+      </w:r>
+      <w:proofErr w:type="gramEnd"/>
+      <w:r>
+        <w:rPr>
+          <w:i/>
+          <w:iCs/>
+          <w:color w:val="444444"/>
+        </w:rPr>
+        <w:t xml:space="preserve">  Hobby Project</w:t>
+      </w:r>
+    </w:p>
+    <w:p>
+      <w:pPr>
+        <w:pStyle w:val="ListParagraph"/>
+        <w:numPr>
+          <w:ilvl w:val="0"/>
+          <w:numId w:val="2"/>
+        </w:numPr>
+        <w:spacing w:before="40" w:after="40"/>
+      </w:pPr>
+      <w:r>
+        <w:rPr>
+          <w:sz w:val="20"/>
+          <w:szCs w:val="20"/>
+        </w:rPr>
+        <w:t>Developed a cinema ticketing and operations management system supporting both customer-facing and internal business workflows with role-based access.</w:t>
       </w:r>
     </w:p>
     <w:p>
@@ -1989,6 +1989,7 @@
   <w:style w:type="character" w:default="1" w:styleId="DefaultParagraphFont">
     <w:name w:val="Default Paragraph Font"/>
     <w:uiPriority w:val="1"/>
+    <w:semiHidden/>
     <w:unhideWhenUsed/>
   </w:style>
   <w:style w:type="table" w:default="1" w:styleId="TableNormal">
@@ -2133,6 +2134,30 @@
       <w:color w:val="auto"/>
       <w:sz w:val="24"/>
       <w:szCs w:val="24"/>
+    </w:rPr>
+  </w:style>
+  <w:style w:type="character" w:styleId="UnresolvedMention">
+    <w:name w:val="Unresolved Mention"/>
+    <w:basedOn w:val="DefaultParagraphFont"/>
+    <w:uiPriority w:val="99"/>
+    <w:semiHidden/>
+    <w:unhideWhenUsed/>
+    <w:rsid w:val="00DB1262"/>
+    <w:rPr>
+      <w:color w:val="605E5C"/>
+      <w:shd w:val="clear" w:color="auto" w:fill="E1DFDD"/>
+    </w:rPr>
+  </w:style>
+  <w:style w:type="character" w:styleId="FollowedHyperlink">
+    <w:name w:val="FollowedHyperlink"/>
+    <w:basedOn w:val="DefaultParagraphFont"/>
+    <w:uiPriority w:val="99"/>
+    <w:semiHidden/>
+    <w:unhideWhenUsed/>
+    <w:rsid w:val="00DB1262"/>
+    <w:rPr>
+      <w:color w:val="96607D" w:themeColor="followedHyperlink"/>
+      <w:u w:val="single"/>
     </w:rPr>
   </w:style>
 </w:styles>

</xml_diff>

<commit_message>
feat: add linked in link in index and cv source document
</commit_message>
<xml_diff>
--- a/Dava_Hannas_Putra_ATS_CV.docx
+++ b/Dava_Hannas_Putra_ATS_CV.docx
@@ -101,6 +101,17 @@
           <w:t>https://davahs.pro</w:t>
         </w:r>
       </w:hyperlink>
+      <w:r>
+        <w:t xml:space="preserve"> | </w:t>
+      </w:r>
+      <w:hyperlink r:id="rId7" w:history="1">
+        <w:r>
+          <w:rPr>
+            <w:rStyle w:val="Hyperlink"/>
+          </w:rPr>
+          <w:t>https://www.linkedin.com/in/dava-hannas-putra-a7259228a/</w:t>
+        </w:r>
+      </w:hyperlink>
     </w:p>
     <w:p>
       <w:pPr>
@@ -826,6 +837,7 @@
           <w:sz w:val="20"/>
           <w:szCs w:val="20"/>
         </w:rPr>
+        <w:lastRenderedPageBreak/>
         <w:t>Provide one-on-one academic mentoring, problem-solving guidance, and exam preparation support.</w:t>
       </w:r>
     </w:p>
@@ -843,7 +855,6 @@
           <w:sz w:val="22"/>
           <w:szCs w:val="22"/>
         </w:rPr>
-        <w:lastRenderedPageBreak/>
         <w:t>Frontend Developer</w:t>
       </w:r>
       <w:r>

</xml_diff>